<commit_message>
folder structure for clean architectire
</commit_message>
<xml_diff>
--- a/docs/ABC_Pharmacy_Phasewise_Complete.docx
+++ b/docs/ABC_Pharmacy_Phasewise_Complete.docx
@@ -1,21 +1,20 @@
 
 <file path=word/document.xml><?xml version="1.0" encoding="utf-8"?>
-<w:document xmlns:mc="http://schemas.openxmlformats.org/markup-compatibility/2006" xmlns:ve="http://schemas.openxmlformats.org/markup-compatibility/2006" xmlns:o="urn:schemas-microsoft-com:office:office" xmlns:r="http://schemas.openxmlformats.org/officeDocument/2006/relationships" xmlns:m="http://schemas.openxmlformats.org/officeDocument/2006/math" xmlns:v="urn:schemas-microsoft-com:vml" xmlns:wp="http://schemas.openxmlformats.org/drawingml/2006/wordprocessingDrawing" xmlns:w10="urn:schemas-microsoft-com:office:word" xmlns:w="http://schemas.openxmlformats.org/wordprocessingml/2006/main" xmlns:wne="http://schemas.microsoft.com/office/word/2006/wordml" xmlns:a="http://schemas.openxmlformats.org/drawingml/2006/main" xmlns:pic="http://schemas.openxmlformats.org/drawingml/2006/picture" xmlns:wpg="http://schemas.microsoft.com/office/word/2010/wordprocessingGroup" xmlns:wps="http://schemas.microsoft.com/office/word/2010/wordprocessingShape" xmlns:w14="http://schemas.microsoft.com/office/word/2010/wordml" mc:Ignorable="w14" xml:space="preserve">
+<w:document xmlns:wpc="http://schemas.microsoft.com/office/word/2010/wordprocessingCanvas" xmlns:cx="http://schemas.microsoft.com/office/drawing/2014/chartex" xmlns:cx1="http://schemas.microsoft.com/office/drawing/2015/9/8/chartex" xmlns:cx2="http://schemas.microsoft.com/office/drawing/2015/10/21/chartex" xmlns:cx3="http://schemas.microsoft.com/office/drawing/2016/5/9/chartex" xmlns:cx4="http://schemas.microsoft.com/office/drawing/2016/5/10/chartex" xmlns:cx5="http://schemas.microsoft.com/office/drawing/2016/5/11/chartex" xmlns:cx6="http://schemas.microsoft.com/office/drawing/2016/5/12/chartex" xmlns:cx7="http://schemas.microsoft.com/office/drawing/2016/5/13/chartex" xmlns:cx8="http://schemas.microsoft.com/office/drawing/2016/5/14/chartex" xmlns:mc="http://schemas.openxmlformats.org/markup-compatibility/2006" xmlns:aink="http://schemas.microsoft.com/office/drawing/2016/ink" xmlns:am3d="http://schemas.microsoft.com/office/drawing/2017/model3d" xmlns:o="urn:schemas-microsoft-com:office:office" xmlns:oel="http://schemas.microsoft.com/office/2019/extlst" xmlns:r="http://schemas.openxmlformats.org/officeDocument/2006/relationships" xmlns:m="http://schemas.openxmlformats.org/officeDocument/2006/math" xmlns:v="urn:schemas-microsoft-com:vml" xmlns:wp14="http://schemas.microsoft.com/office/word/2010/wordprocessingDrawing" xmlns:wp="http://schemas.openxmlformats.org/drawingml/2006/wordprocessingDrawing" xmlns:w10="urn:schemas-microsoft-com:office:word" xmlns:w="http://schemas.openxmlformats.org/wordprocessingml/2006/main" xmlns:w14="http://schemas.microsoft.com/office/word/2010/wordml" xmlns:w15="http://schemas.microsoft.com/office/word/2012/wordml" xmlns:w16cex="http://schemas.microsoft.com/office/word/2018/wordml/cex" xmlns:w16cid="http://schemas.microsoft.com/office/word/2016/wordml/cid" xmlns:w16="http://schemas.microsoft.com/office/word/2018/wordml" xmlns:w16du="http://schemas.microsoft.com/office/word/2023/wordml/word16du" xmlns:w16sdtdh="http://schemas.microsoft.com/office/word/2020/wordml/sdtdatahash" xmlns:w16sdtfl="http://schemas.microsoft.com/office/word/2024/wordml/sdtformatlock" xmlns:w16se="http://schemas.microsoft.com/office/word/2015/wordml/symex" xmlns:wpg="http://schemas.microsoft.com/office/word/2010/wordprocessingGroup" xmlns:wpi="http://schemas.microsoft.com/office/word/2010/wordprocessingInk" xmlns:wne="http://schemas.microsoft.com/office/word/2006/wordml" xmlns:wps="http://schemas.microsoft.com/office/word/2010/wordprocessingShape" mc:Ignorable="w14 w15 w16se w16cid w16 w16cex w16sdtdh w16sdtfl w16du wp14">
   <w:body>
     <w:p>
       <w:pPr>
         <w:spacing w:before="89"/>
-        <w:ind w:left="580" w:right="0" w:firstLine="0"/>
-        <w:jc w:val="left"/>
-        <w:rPr>
-          <w:sz w:val="16"/>
-        </w:rPr>
-      </w:pPr>
-      <w:r>
-        <w:rPr>
-          <w:sz w:val="16"/>
-        </w:rPr>
-        <w:t>ABC PHARMACY - STEP BY STEP IMPLEMENTATION PLAN (CLEAN ARCHITECTURE + REACT + .NET WEB </w:t>
+        <w:ind w:left="580"/>
+        <w:rPr>
+          <w:sz w:val="16"/>
+        </w:rPr>
+      </w:pPr>
+      <w:r>
+        <w:rPr>
+          <w:sz w:val="16"/>
+        </w:rPr>
+        <w:t xml:space="preserve">ABC PHARMACY - STEP BY STEP IMPLEMENTATION PLAN (CLEAN ARCHITECTURE + REACT + .NET WEB </w:t>
       </w:r>
       <w:r>
         <w:rPr>
@@ -31,8 +30,7 @@
         <w:spacing w:before="170"/>
       </w:pPr>
       <w:r>
-        <w:rPr/>
-        <w:t>PHASE 1: PROJECT </w:t>
+        <w:t xml:space="preserve">PHASE 1: PROJECT </w:t>
       </w:r>
       <w:r>
         <w:rPr>
@@ -49,20 +47,18 @@
           <w:numId w:val="1"/>
         </w:numPr>
         <w:tabs>
-          <w:tab w:pos="772" w:val="left" w:leader="none"/>
+          <w:tab w:val="left" w:pos="772"/>
         </w:tabs>
-        <w:spacing w:line="176" w:lineRule="exact" w:before="0" w:after="0"/>
-        <w:ind w:left="772" w:right="0" w:hanging="192"/>
-        <w:jc w:val="left"/>
-        <w:rPr>
-          <w:sz w:val="16"/>
-        </w:rPr>
-      </w:pPr>
-      <w:r>
-        <w:rPr>
-          <w:sz w:val="16"/>
-        </w:rPr>
-        <w:t>Create </w:t>
+        <w:ind w:hanging="192"/>
+        <w:rPr>
+          <w:sz w:val="16"/>
+        </w:rPr>
+      </w:pPr>
+      <w:r>
+        <w:rPr>
+          <w:sz w:val="16"/>
+        </w:rPr>
+        <w:t xml:space="preserve">Create </w:t>
       </w:r>
       <w:r>
         <w:rPr>
@@ -77,15 +73,24 @@
         <w:pStyle w:val="BodyText"/>
       </w:pPr>
       <w:r>
-        <w:rPr/>
-        <w:t>dotnet new sln -n </w:t>
-      </w:r>
+        <w:t xml:space="preserve">dotnet new </w:t>
+      </w:r>
+      <w:proofErr w:type="spellStart"/>
+      <w:r>
+        <w:t>sln</w:t>
+      </w:r>
+      <w:proofErr w:type="spellEnd"/>
+      <w:r>
+        <w:t xml:space="preserve"> -n </w:t>
+      </w:r>
+      <w:proofErr w:type="spellStart"/>
       <w:r>
         <w:rPr>
           <w:spacing w:val="-2"/>
         </w:rPr>
         <w:t>ABCPharmacy</w:t>
       </w:r>
+      <w:proofErr w:type="spellEnd"/>
     </w:p>
     <w:p>
       <w:pPr>
@@ -95,20 +100,19 @@
           <w:numId w:val="1"/>
         </w:numPr>
         <w:tabs>
-          <w:tab w:pos="772" w:val="left" w:leader="none"/>
+          <w:tab w:val="left" w:pos="772"/>
         </w:tabs>
-        <w:spacing w:line="179" w:lineRule="exact" w:before="171" w:after="0"/>
-        <w:ind w:left="772" w:right="0" w:hanging="192"/>
-        <w:jc w:val="left"/>
-        <w:rPr>
-          <w:sz w:val="16"/>
-        </w:rPr>
-      </w:pPr>
-      <w:r>
-        <w:rPr>
-          <w:sz w:val="16"/>
-        </w:rPr>
-        <w:t>Create </w:t>
+        <w:spacing w:before="171" w:line="179" w:lineRule="exact"/>
+        <w:ind w:hanging="192"/>
+        <w:rPr>
+          <w:sz w:val="16"/>
+        </w:rPr>
+      </w:pPr>
+      <w:r>
+        <w:rPr>
+          <w:sz w:val="16"/>
+        </w:rPr>
+        <w:t xml:space="preserve">Create </w:t>
       </w:r>
       <w:r>
         <w:rPr>
@@ -124,66 +128,90 @@
         <w:spacing w:line="176" w:lineRule="exact"/>
       </w:pPr>
       <w:r>
-        <w:rPr/>
-        <w:t>dotnet new webapi -n </w:t>
-      </w:r>
+        <w:t xml:space="preserve">dotnet new </w:t>
+      </w:r>
+      <w:proofErr w:type="spellStart"/>
+      <w:r>
+        <w:t>webapi</w:t>
+      </w:r>
+      <w:proofErr w:type="spellEnd"/>
+      <w:r>
+        <w:t xml:space="preserve"> -n </w:t>
+      </w:r>
+      <w:proofErr w:type="spellStart"/>
       <w:r>
         <w:rPr>
           <w:spacing w:val="-2"/>
         </w:rPr>
         <w:t>ABCPharmacy.API</w:t>
       </w:r>
-    </w:p>
-    <w:p>
-      <w:pPr>
-        <w:pStyle w:val="BodyText"/>
-        <w:spacing w:line="232" w:lineRule="auto" w:before="2"/>
+      <w:proofErr w:type="spellEnd"/>
+    </w:p>
+    <w:p>
+      <w:pPr>
+        <w:pStyle w:val="BodyText"/>
+        <w:spacing w:before="2" w:line="232" w:lineRule="auto"/>
         <w:ind w:right="4035"/>
       </w:pPr>
       <w:r>
-        <w:rPr/>
         <w:t>dotnet</w:t>
       </w:r>
       <w:r>
         <w:rPr>
           <w:spacing w:val="-9"/>
         </w:rPr>
-        <w:t> </w:t>
-      </w:r>
-      <w:r>
-        <w:rPr/>
+        <w:t xml:space="preserve"> </w:t>
+      </w:r>
+      <w:r>
         <w:t>new</w:t>
       </w:r>
       <w:r>
         <w:rPr>
           <w:spacing w:val="-9"/>
         </w:rPr>
-        <w:t> </w:t>
-      </w:r>
-      <w:r>
-        <w:rPr/>
+        <w:t xml:space="preserve"> </w:t>
+      </w:r>
+      <w:proofErr w:type="spellStart"/>
+      <w:r>
         <w:t>classlib</w:t>
       </w:r>
+      <w:proofErr w:type="spellEnd"/>
       <w:r>
         <w:rPr>
           <w:spacing w:val="-9"/>
         </w:rPr>
-        <w:t> </w:t>
-      </w:r>
-      <w:r>
-        <w:rPr/>
+        <w:t xml:space="preserve"> </w:t>
+      </w:r>
+      <w:r>
         <w:t>-n</w:t>
       </w:r>
       <w:r>
         <w:rPr>
           <w:spacing w:val="-9"/>
         </w:rPr>
-        <w:t> </w:t>
-      </w:r>
-      <w:r>
-        <w:rPr/>
-        <w:t>ABCPharmacy.Application dotnet new classlib -n ABCPharmacy.Domain</w:t>
-      </w:r>
+        <w:t xml:space="preserve"> </w:t>
+      </w:r>
+      <w:proofErr w:type="spellStart"/>
+      <w:r>
+        <w:t>ABCPharmacy.Application</w:t>
+      </w:r>
+      <w:proofErr w:type="spellEnd"/>
+      <w:r>
+        <w:t xml:space="preserve"> dotnet new </w:t>
+      </w:r>
+      <w:proofErr w:type="spellStart"/>
+      <w:r>
+        <w:t>classlib</w:t>
+      </w:r>
+      <w:proofErr w:type="spellEnd"/>
+      <w:r>
+        <w:t xml:space="preserve"> -n </w:t>
+      </w:r>
+      <w:proofErr w:type="spellStart"/>
+      <w:r>
+        <w:t>ABCPharmacy.Domain</w:t>
+      </w:r>
+      <w:proofErr w:type="spellEnd"/>
     </w:p>
     <w:p>
       <w:pPr>
@@ -191,15 +219,24 @@
         <w:spacing w:line="178" w:lineRule="exact"/>
       </w:pPr>
       <w:r>
-        <w:rPr/>
-        <w:t>dotnet new classlib -n </w:t>
-      </w:r>
+        <w:t xml:space="preserve">dotnet new </w:t>
+      </w:r>
+      <w:proofErr w:type="spellStart"/>
+      <w:r>
+        <w:t>classlib</w:t>
+      </w:r>
+      <w:proofErr w:type="spellEnd"/>
+      <w:r>
+        <w:t xml:space="preserve"> -n </w:t>
+      </w:r>
+      <w:proofErr w:type="spellStart"/>
       <w:r>
         <w:rPr>
           <w:spacing w:val="-2"/>
         </w:rPr>
         <w:t>ABCPharmacy.Infrastructure</w:t>
       </w:r>
+      <w:proofErr w:type="spellEnd"/>
     </w:p>
     <w:p>
       <w:pPr>
@@ -209,20 +246,19 @@
           <w:numId w:val="1"/>
         </w:numPr>
         <w:tabs>
-          <w:tab w:pos="772" w:val="left" w:leader="none"/>
+          <w:tab w:val="left" w:pos="772"/>
         </w:tabs>
-        <w:spacing w:line="179" w:lineRule="exact" w:before="170" w:after="0"/>
-        <w:ind w:left="772" w:right="0" w:hanging="192"/>
-        <w:jc w:val="left"/>
-        <w:rPr>
-          <w:sz w:val="16"/>
-        </w:rPr>
-      </w:pPr>
-      <w:r>
-        <w:rPr>
-          <w:sz w:val="16"/>
-        </w:rPr>
-        <w:t>Add to </w:t>
+        <w:spacing w:before="170" w:line="179" w:lineRule="exact"/>
+        <w:ind w:hanging="192"/>
+        <w:rPr>
+          <w:sz w:val="16"/>
+        </w:rPr>
+      </w:pPr>
+      <w:r>
+        <w:rPr>
+          <w:sz w:val="16"/>
+        </w:rPr>
+        <w:t xml:space="preserve">Add to </w:t>
       </w:r>
       <w:r>
         <w:rPr>
@@ -238,56 +274,81 @@
         <w:spacing w:line="176" w:lineRule="exact"/>
       </w:pPr>
       <w:r>
-        <w:rPr/>
-        <w:t>dotnet sln add </w:t>
-      </w:r>
+        <w:t xml:space="preserve">dotnet </w:t>
+      </w:r>
+      <w:proofErr w:type="spellStart"/>
+      <w:r>
+        <w:t>sln</w:t>
+      </w:r>
+      <w:proofErr w:type="spellEnd"/>
+      <w:r>
+        <w:t xml:space="preserve"> add </w:t>
+      </w:r>
+      <w:proofErr w:type="spellStart"/>
       <w:r>
         <w:rPr>
           <w:spacing w:val="-2"/>
         </w:rPr>
         <w:t>ABCPharmacy.API</w:t>
       </w:r>
-    </w:p>
-    <w:p>
-      <w:pPr>
-        <w:pStyle w:val="BodyText"/>
-        <w:spacing w:line="232" w:lineRule="auto" w:before="2"/>
+      <w:proofErr w:type="spellEnd"/>
+    </w:p>
+    <w:p>
+      <w:pPr>
+        <w:pStyle w:val="BodyText"/>
+        <w:spacing w:before="2" w:line="232" w:lineRule="auto"/>
         <w:ind w:right="4851"/>
       </w:pPr>
       <w:r>
-        <w:rPr/>
         <w:t>dotnet</w:t>
       </w:r>
       <w:r>
         <w:rPr>
           <w:spacing w:val="-11"/>
         </w:rPr>
-        <w:t> </w:t>
-      </w:r>
-      <w:r>
-        <w:rPr/>
+        <w:t xml:space="preserve"> </w:t>
+      </w:r>
+      <w:proofErr w:type="spellStart"/>
+      <w:r>
         <w:t>sln</w:t>
       </w:r>
+      <w:proofErr w:type="spellEnd"/>
       <w:r>
         <w:rPr>
           <w:spacing w:val="-11"/>
         </w:rPr>
-        <w:t> </w:t>
-      </w:r>
-      <w:r>
-        <w:rPr/>
+        <w:t xml:space="preserve"> </w:t>
+      </w:r>
+      <w:r>
         <w:t>add</w:t>
       </w:r>
       <w:r>
         <w:rPr>
           <w:spacing w:val="-11"/>
         </w:rPr>
-        <w:t> </w:t>
-      </w:r>
-      <w:r>
-        <w:rPr/>
-        <w:t>ABCPharmacy.Application dotnet sln add ABCPharmacy.Domain</w:t>
-      </w:r>
+        <w:t xml:space="preserve"> </w:t>
+      </w:r>
+      <w:proofErr w:type="spellStart"/>
+      <w:r>
+        <w:t>ABCPharmacy.Application</w:t>
+      </w:r>
+      <w:proofErr w:type="spellEnd"/>
+      <w:r>
+        <w:t xml:space="preserve"> dotnet </w:t>
+      </w:r>
+      <w:proofErr w:type="spellStart"/>
+      <w:r>
+        <w:t>sln</w:t>
+      </w:r>
+      <w:proofErr w:type="spellEnd"/>
+      <w:r>
+        <w:t xml:space="preserve"> add </w:t>
+      </w:r>
+      <w:proofErr w:type="spellStart"/>
+      <w:r>
+        <w:t>ABCPharmacy.Domain</w:t>
+      </w:r>
+      <w:proofErr w:type="spellEnd"/>
     </w:p>
     <w:p>
       <w:pPr>
@@ -295,20 +356,29 @@
         <w:spacing w:line="178" w:lineRule="exact"/>
       </w:pPr>
       <w:r>
-        <w:rPr/>
-        <w:t>dotnet sln add </w:t>
-      </w:r>
+        <w:t xml:space="preserve">dotnet </w:t>
+      </w:r>
+      <w:proofErr w:type="spellStart"/>
+      <w:r>
+        <w:t>sln</w:t>
+      </w:r>
+      <w:proofErr w:type="spellEnd"/>
+      <w:r>
+        <w:t xml:space="preserve"> add </w:t>
+      </w:r>
+      <w:proofErr w:type="spellStart"/>
       <w:r>
         <w:rPr>
           <w:spacing w:val="-2"/>
         </w:rPr>
         <w:t>ABCPharmacy.Infrastructure</w:t>
       </w:r>
-    </w:p>
-    <w:p>
-      <w:pPr>
-        <w:pStyle w:val="BodyText"/>
-        <w:spacing w:line="240" w:lineRule="auto" w:before="165"/>
+      <w:proofErr w:type="spellEnd"/>
+    </w:p>
+    <w:p>
+      <w:pPr>
+        <w:pStyle w:val="BodyText"/>
+        <w:spacing w:before="165" w:line="240" w:lineRule="auto"/>
         <w:ind w:left="0"/>
       </w:pPr>
     </w:p>
@@ -317,8 +387,7 @@
         <w:pStyle w:val="Heading1"/>
       </w:pPr>
       <w:r>
-        <w:rPr/>
-        <w:t>PHASE 2: DOMAIN </w:t>
+        <w:t xml:space="preserve">PHASE 2: DOMAIN </w:t>
       </w:r>
       <w:r>
         <w:rPr>
@@ -335,20 +404,19 @@
           <w:numId w:val="1"/>
         </w:numPr>
         <w:tabs>
-          <w:tab w:pos="772" w:val="left" w:leader="none"/>
+          <w:tab w:val="left" w:pos="772"/>
         </w:tabs>
-        <w:spacing w:line="179" w:lineRule="exact" w:before="0" w:after="0"/>
-        <w:ind w:left="772" w:right="0" w:hanging="192"/>
-        <w:jc w:val="left"/>
-        <w:rPr>
-          <w:sz w:val="16"/>
-        </w:rPr>
-      </w:pPr>
-      <w:r>
-        <w:rPr>
-          <w:sz w:val="16"/>
-        </w:rPr>
-        <w:t>Create Medicine </w:t>
+        <w:spacing w:line="179" w:lineRule="exact"/>
+        <w:ind w:hanging="192"/>
+        <w:rPr>
+          <w:sz w:val="16"/>
+        </w:rPr>
+      </w:pPr>
+      <w:r>
+        <w:rPr>
+          <w:sz w:val="16"/>
+        </w:rPr>
+        <w:t xml:space="preserve">Create Medicine </w:t>
       </w:r>
       <w:r>
         <w:rPr>
@@ -365,8 +433,7 @@
         <w:ind w:left="580"/>
       </w:pPr>
       <w:r>
-        <w:rPr/>
-        <w:t>public class </w:t>
+        <w:t xml:space="preserve">public class </w:t>
       </w:r>
       <w:r>
         <w:rPr>
@@ -377,9 +444,8 @@
     </w:p>
     <w:p>
       <w:pPr>
-        <w:spacing w:line="173" w:lineRule="exact" w:before="0"/>
-        <w:ind w:left="580" w:right="0" w:firstLine="0"/>
-        <w:jc w:val="left"/>
+        <w:spacing w:line="173" w:lineRule="exact"/>
+        <w:ind w:left="580"/>
         <w:rPr>
           <w:sz w:val="16"/>
         </w:rPr>
@@ -398,8 +464,7 @@
         <w:ind w:left="964"/>
       </w:pPr>
       <w:r>
-        <w:rPr/>
-        <w:t>public int Id { get; set; </w:t>
+        <w:t xml:space="preserve">public int Id { get; set; </w:t>
       </w:r>
       <w:r>
         <w:rPr>
@@ -411,142 +476,134 @@
     <w:p>
       <w:pPr>
         <w:pStyle w:val="BodyText"/>
-        <w:spacing w:line="232" w:lineRule="auto" w:before="1"/>
+        <w:spacing w:before="1" w:line="232" w:lineRule="auto"/>
         <w:ind w:left="964" w:right="4851"/>
       </w:pPr>
       <w:r>
-        <w:rPr/>
         <w:t>public</w:t>
       </w:r>
       <w:r>
         <w:rPr>
           <w:spacing w:val="-6"/>
         </w:rPr>
-        <w:t> </w:t>
-      </w:r>
-      <w:r>
-        <w:rPr/>
+        <w:t xml:space="preserve"> </w:t>
+      </w:r>
+      <w:r>
         <w:t>string</w:t>
       </w:r>
       <w:r>
         <w:rPr>
           <w:spacing w:val="-6"/>
         </w:rPr>
-        <w:t> </w:t>
-      </w:r>
-      <w:r>
-        <w:rPr/>
+        <w:t xml:space="preserve"> </w:t>
+      </w:r>
+      <w:proofErr w:type="spellStart"/>
+      <w:r>
         <w:t>FullName</w:t>
       </w:r>
+      <w:proofErr w:type="spellEnd"/>
       <w:r>
         <w:rPr>
           <w:spacing w:val="-6"/>
         </w:rPr>
-        <w:t> </w:t>
-      </w:r>
-      <w:r>
-        <w:rPr/>
+        <w:t xml:space="preserve"> </w:t>
+      </w:r>
+      <w:r>
         <w:t>{</w:t>
       </w:r>
       <w:r>
         <w:rPr>
           <w:spacing w:val="-6"/>
         </w:rPr>
-        <w:t> </w:t>
-      </w:r>
-      <w:r>
-        <w:rPr/>
+        <w:t xml:space="preserve"> </w:t>
+      </w:r>
+      <w:r>
         <w:t>get;</w:t>
       </w:r>
       <w:r>
         <w:rPr>
           <w:spacing w:val="-6"/>
         </w:rPr>
-        <w:t> </w:t>
-      </w:r>
-      <w:r>
-        <w:rPr/>
+        <w:t xml:space="preserve"> </w:t>
+      </w:r>
+      <w:r>
         <w:t>set;</w:t>
       </w:r>
       <w:r>
         <w:rPr>
           <w:spacing w:val="-6"/>
         </w:rPr>
-        <w:t> </w:t>
-      </w:r>
-      <w:r>
-        <w:rPr/>
+        <w:t xml:space="preserve"> </w:t>
+      </w:r>
+      <w:r>
         <w:t>} public string Notes { get; set; }</w:t>
       </w:r>
     </w:p>
     <w:p>
       <w:pPr>
         <w:pStyle w:val="BodyText"/>
-        <w:spacing w:line="232" w:lineRule="auto" w:before="1"/>
+        <w:spacing w:before="1" w:line="232" w:lineRule="auto"/>
         <w:ind w:left="964" w:right="4035"/>
       </w:pPr>
       <w:r>
-        <w:rPr/>
         <w:t>public</w:t>
       </w:r>
       <w:r>
         <w:rPr>
           <w:spacing w:val="-6"/>
         </w:rPr>
-        <w:t> </w:t>
-      </w:r>
-      <w:r>
-        <w:rPr/>
+        <w:t xml:space="preserve"> </w:t>
+      </w:r>
+      <w:proofErr w:type="spellStart"/>
+      <w:r>
         <w:t>DateTime</w:t>
       </w:r>
+      <w:proofErr w:type="spellEnd"/>
       <w:r>
         <w:rPr>
           <w:spacing w:val="-6"/>
         </w:rPr>
-        <w:t> </w:t>
-      </w:r>
-      <w:r>
-        <w:rPr/>
+        <w:t xml:space="preserve"> </w:t>
+      </w:r>
+      <w:proofErr w:type="spellStart"/>
+      <w:r>
         <w:t>ExpiryDate</w:t>
       </w:r>
+      <w:proofErr w:type="spellEnd"/>
       <w:r>
         <w:rPr>
           <w:spacing w:val="-6"/>
         </w:rPr>
-        <w:t> </w:t>
-      </w:r>
-      <w:r>
-        <w:rPr/>
+        <w:t xml:space="preserve"> </w:t>
+      </w:r>
+      <w:r>
         <w:t>{</w:t>
       </w:r>
       <w:r>
         <w:rPr>
           <w:spacing w:val="-6"/>
         </w:rPr>
-        <w:t> </w:t>
-      </w:r>
-      <w:r>
-        <w:rPr/>
+        <w:t xml:space="preserve"> </w:t>
+      </w:r>
+      <w:r>
         <w:t>get;</w:t>
       </w:r>
       <w:r>
         <w:rPr>
           <w:spacing w:val="-6"/>
         </w:rPr>
-        <w:t> </w:t>
-      </w:r>
-      <w:r>
-        <w:rPr/>
+        <w:t xml:space="preserve"> </w:t>
+      </w:r>
+      <w:r>
         <w:t>set;</w:t>
       </w:r>
       <w:r>
         <w:rPr>
           <w:spacing w:val="-6"/>
         </w:rPr>
-        <w:t> </w:t>
-      </w:r>
-      <w:r>
-        <w:rPr/>
+        <w:t xml:space="preserve"> </w:t>
+      </w:r>
+      <w:r>
         <w:t>} public int Quantity { get; set; }</w:t>
       </w:r>
     </w:p>
@@ -557,75 +614,67 @@
         <w:ind w:left="964" w:right="4851"/>
       </w:pPr>
       <w:r>
-        <w:rPr/>
         <w:t>public</w:t>
       </w:r>
       <w:r>
         <w:rPr>
           <w:spacing w:val="-6"/>
         </w:rPr>
-        <w:t> </w:t>
-      </w:r>
-      <w:r>
-        <w:rPr/>
+        <w:t xml:space="preserve"> </w:t>
+      </w:r>
+      <w:r>
         <w:t>decimal</w:t>
       </w:r>
       <w:r>
         <w:rPr>
           <w:spacing w:val="-6"/>
         </w:rPr>
-        <w:t> </w:t>
-      </w:r>
-      <w:r>
-        <w:rPr/>
+        <w:t xml:space="preserve"> </w:t>
+      </w:r>
+      <w:r>
         <w:t>Price</w:t>
       </w:r>
       <w:r>
         <w:rPr>
           <w:spacing w:val="-6"/>
         </w:rPr>
-        <w:t> </w:t>
-      </w:r>
-      <w:r>
-        <w:rPr/>
+        <w:t xml:space="preserve"> </w:t>
+      </w:r>
+      <w:r>
         <w:t>{</w:t>
       </w:r>
       <w:r>
         <w:rPr>
           <w:spacing w:val="-6"/>
         </w:rPr>
-        <w:t> </w:t>
-      </w:r>
-      <w:r>
-        <w:rPr/>
+        <w:t xml:space="preserve"> </w:t>
+      </w:r>
+      <w:r>
         <w:t>get;</w:t>
       </w:r>
       <w:r>
         <w:rPr>
           <w:spacing w:val="-6"/>
         </w:rPr>
-        <w:t> </w:t>
-      </w:r>
-      <w:r>
-        <w:rPr/>
+        <w:t xml:space="preserve"> </w:t>
+      </w:r>
+      <w:r>
         <w:t>set;</w:t>
       </w:r>
       <w:r>
         <w:rPr>
           <w:spacing w:val="-6"/>
         </w:rPr>
-        <w:t> </w:t>
-      </w:r>
-      <w:r>
-        <w:rPr/>
+        <w:t xml:space="preserve"> </w:t>
+      </w:r>
+      <w:r>
         <w:t>} public string Brand { get; set; }</w:t>
       </w:r>
     </w:p>
     <w:p>
       <w:pPr>
-        <w:spacing w:line="178" w:lineRule="exact" w:before="0"/>
-        <w:ind w:left="580" w:right="0" w:firstLine="0"/>
-        <w:jc w:val="left"/>
+        <w:spacing w:line="178" w:lineRule="exact"/>
+        <w:ind w:left="580"/>
         <w:rPr>
           <w:sz w:val="16"/>
         </w:rPr>
@@ -641,7 +690,7 @@
     <w:p>
       <w:pPr>
         <w:pStyle w:val="BodyText"/>
-        <w:spacing w:line="240" w:lineRule="auto" w:before="165"/>
+        <w:spacing w:before="165" w:line="240" w:lineRule="auto"/>
         <w:ind w:left="0"/>
       </w:pPr>
     </w:p>
@@ -651,8 +700,7 @@
         <w:spacing w:before="1"/>
       </w:pPr>
       <w:r>
-        <w:rPr/>
-        <w:t>PHASE 3: APPLICATION </w:t>
+        <w:t xml:space="preserve">PHASE 3: APPLICATION </w:t>
       </w:r>
       <w:r>
         <w:rPr>
@@ -669,20 +717,18 @@
           <w:numId w:val="1"/>
         </w:numPr>
         <w:tabs>
-          <w:tab w:pos="772" w:val="left" w:leader="none"/>
+          <w:tab w:val="left" w:pos="772"/>
         </w:tabs>
-        <w:spacing w:line="176" w:lineRule="exact" w:before="0" w:after="0"/>
-        <w:ind w:left="772" w:right="0" w:hanging="192"/>
-        <w:jc w:val="left"/>
-        <w:rPr>
-          <w:sz w:val="16"/>
-        </w:rPr>
-      </w:pPr>
-      <w:r>
-        <w:rPr>
-          <w:sz w:val="16"/>
-        </w:rPr>
-        <w:t>Create </w:t>
+        <w:ind w:hanging="192"/>
+        <w:rPr>
+          <w:sz w:val="16"/>
+        </w:rPr>
+      </w:pPr>
+      <w:r>
+        <w:rPr>
+          <w:sz w:val="16"/>
+        </w:rPr>
+        <w:t xml:space="preserve">Create </w:t>
       </w:r>
       <w:r>
         <w:rPr>
@@ -700,28 +746,45 @@
           <w:numId w:val="1"/>
         </w:numPr>
         <w:tabs>
-          <w:tab w:pos="772" w:val="left" w:leader="none"/>
+          <w:tab w:val="left" w:pos="772"/>
         </w:tabs>
-        <w:spacing w:line="232" w:lineRule="auto" w:before="1" w:after="0"/>
-        <w:ind w:left="772" w:right="6757" w:hanging="193"/>
-        <w:jc w:val="left"/>
-        <w:rPr>
-          <w:sz w:val="16"/>
-        </w:rPr>
-      </w:pPr>
-      <w:r>
-        <w:rPr>
-          <w:sz w:val="16"/>
-        </w:rPr>
-        <w:t>Create Interfaces </w:t>
-      </w:r>
-      <w:r>
-        <w:rPr>
-          <w:spacing w:val="-2"/>
-          <w:sz w:val="16"/>
-        </w:rPr>
-        <w:t>IMedicineRepository IMedicineService</w:t>
-      </w:r>
+        <w:spacing w:before="1" w:line="232" w:lineRule="auto"/>
+        <w:ind w:right="6757"/>
+        <w:rPr>
+          <w:sz w:val="16"/>
+        </w:rPr>
+      </w:pPr>
+      <w:r>
+        <w:rPr>
+          <w:sz w:val="16"/>
+        </w:rPr>
+        <w:t xml:space="preserve">Create Interfaces </w:t>
+      </w:r>
+      <w:proofErr w:type="spellStart"/>
+      <w:r>
+        <w:rPr>
+          <w:spacing w:val="-2"/>
+          <w:sz w:val="16"/>
+        </w:rPr>
+        <w:t>IMedicineRepository</w:t>
+      </w:r>
+      <w:proofErr w:type="spellEnd"/>
+      <w:r>
+        <w:rPr>
+          <w:spacing w:val="-2"/>
+          <w:sz w:val="16"/>
+        </w:rPr>
+        <w:t xml:space="preserve"> </w:t>
+      </w:r>
+      <w:proofErr w:type="spellStart"/>
+      <w:r>
+        <w:rPr>
+          <w:spacing w:val="-2"/>
+          <w:sz w:val="16"/>
+        </w:rPr>
+        <w:t>IMedicineService</w:t>
+      </w:r>
+      <w:proofErr w:type="spellEnd"/>
     </w:p>
     <w:p>
       <w:pPr>
@@ -731,11 +794,10 @@
           <w:numId w:val="1"/>
         </w:numPr>
         <w:tabs>
-          <w:tab w:pos="772" w:val="left" w:leader="none"/>
+          <w:tab w:val="left" w:pos="772"/>
         </w:tabs>
-        <w:spacing w:line="179" w:lineRule="exact" w:before="173" w:after="0"/>
-        <w:ind w:left="772" w:right="0" w:hanging="192"/>
-        <w:jc w:val="left"/>
+        <w:spacing w:before="173" w:line="179" w:lineRule="exact"/>
+        <w:ind w:hanging="192"/>
         <w:rPr>
           <w:sz w:val="16"/>
         </w:rPr>
@@ -753,8 +815,7 @@
         <w:pStyle w:val="BodyText"/>
       </w:pPr>
       <w:r>
-        <w:rPr/>
-        <w:t>Separation of business logic and </w:t>
+        <w:t xml:space="preserve">Separation of business logic and </w:t>
       </w:r>
       <w:r>
         <w:rPr>
@@ -766,7 +827,7 @@
     <w:p>
       <w:pPr>
         <w:pStyle w:val="BodyText"/>
-        <w:spacing w:line="240" w:lineRule="auto" w:before="165"/>
+        <w:spacing w:before="165" w:line="240" w:lineRule="auto"/>
         <w:ind w:left="0"/>
       </w:pPr>
     </w:p>
@@ -775,8 +836,7 @@
         <w:pStyle w:val="Heading1"/>
       </w:pPr>
       <w:r>
-        <w:rPr/>
-        <w:t>PHASE 4: INFRASTRUCTURE </w:t>
+        <w:t xml:space="preserve">PHASE 4: INFRASTRUCTURE </w:t>
       </w:r>
       <w:r>
         <w:rPr>
@@ -793,11 +853,10 @@
           <w:numId w:val="1"/>
         </w:numPr>
         <w:tabs>
-          <w:tab w:pos="772" w:val="left" w:leader="none"/>
+          <w:tab w:val="left" w:pos="772"/>
         </w:tabs>
-        <w:spacing w:line="232" w:lineRule="auto" w:before="1" w:after="0"/>
-        <w:ind w:left="772" w:right="6181" w:hanging="193"/>
-        <w:jc w:val="left"/>
+        <w:spacing w:before="1" w:line="232" w:lineRule="auto"/>
+        <w:ind w:right="6181"/>
         <w:rPr>
           <w:sz w:val="16"/>
         </w:rPr>
@@ -813,7 +872,7 @@
           <w:spacing w:val="-12"/>
           <w:sz w:val="16"/>
         </w:rPr>
-        <w:t> </w:t>
+        <w:t xml:space="preserve"> </w:t>
       </w:r>
       <w:r>
         <w:rPr>
@@ -826,7 +885,7 @@
           <w:spacing w:val="-12"/>
           <w:sz w:val="16"/>
         </w:rPr>
-        <w:t> </w:t>
+        <w:t xml:space="preserve"> </w:t>
       </w:r>
       <w:r>
         <w:rPr>
@@ -839,21 +898,30 @@
           <w:spacing w:val="-12"/>
           <w:sz w:val="16"/>
         </w:rPr>
-        <w:t> </w:t>
-      </w:r>
-      <w:r>
-        <w:rPr>
-          <w:sz w:val="16"/>
-        </w:rPr>
-        <w:t>storage: </w:t>
-      </w:r>
-      <w:r>
-        <w:rPr>
-          <w:spacing w:val="-2"/>
-          <w:sz w:val="16"/>
-        </w:rPr>
-        <w:t>Data/medicines.json</w:t>
-      </w:r>
+        <w:t xml:space="preserve"> </w:t>
+      </w:r>
+      <w:r>
+        <w:rPr>
+          <w:sz w:val="16"/>
+        </w:rPr>
+        <w:t xml:space="preserve">storage: </w:t>
+      </w:r>
+      <w:r>
+        <w:rPr>
+          <w:spacing w:val="-2"/>
+          <w:sz w:val="16"/>
+        </w:rPr>
+        <w:t>Data/</w:t>
+      </w:r>
+      <w:proofErr w:type="spellStart"/>
+      <w:r>
+        <w:rPr>
+          <w:spacing w:val="-2"/>
+          <w:sz w:val="16"/>
+        </w:rPr>
+        <w:t>medicines.json</w:t>
+      </w:r>
+      <w:proofErr w:type="spellEnd"/>
     </w:p>
     <w:p>
       <w:pPr>
@@ -863,20 +931,19 @@
           <w:numId w:val="1"/>
         </w:numPr>
         <w:tabs>
-          <w:tab w:pos="772" w:val="left" w:leader="none"/>
+          <w:tab w:val="left" w:pos="772"/>
         </w:tabs>
-        <w:spacing w:line="179" w:lineRule="exact" w:before="173" w:after="0"/>
-        <w:ind w:left="772" w:right="0" w:hanging="192"/>
-        <w:jc w:val="left"/>
-        <w:rPr>
-          <w:sz w:val="16"/>
-        </w:rPr>
-      </w:pPr>
-      <w:r>
-        <w:rPr>
-          <w:sz w:val="16"/>
-        </w:rPr>
-        <w:t>Repository </w:t>
+        <w:spacing w:before="173" w:line="179" w:lineRule="exact"/>
+        <w:ind w:hanging="192"/>
+        <w:rPr>
+          <w:sz w:val="16"/>
+        </w:rPr>
+      </w:pPr>
+      <w:r>
+        <w:rPr>
+          <w:sz w:val="16"/>
+        </w:rPr>
+        <w:t xml:space="preserve">Repository </w:t>
       </w:r>
       <w:r>
         <w:rPr>
@@ -894,20 +961,18 @@
           <w:numId w:val="1"/>
         </w:numPr>
         <w:tabs>
-          <w:tab w:pos="964" w:val="left" w:leader="none"/>
+          <w:tab w:val="left" w:pos="964"/>
         </w:tabs>
-        <w:spacing w:line="176" w:lineRule="exact" w:before="0" w:after="0"/>
-        <w:ind w:left="964" w:right="0" w:hanging="192"/>
-        <w:jc w:val="left"/>
-        <w:rPr>
-          <w:sz w:val="16"/>
-        </w:rPr>
-      </w:pPr>
-      <w:r>
-        <w:rPr>
-          <w:sz w:val="16"/>
-        </w:rPr>
-        <w:t>Read </w:t>
+        <w:ind w:hanging="192"/>
+        <w:rPr>
+          <w:sz w:val="16"/>
+        </w:rPr>
+      </w:pPr>
+      <w:r>
+        <w:rPr>
+          <w:sz w:val="16"/>
+        </w:rPr>
+        <w:t xml:space="preserve">Read </w:t>
       </w:r>
       <w:r>
         <w:rPr>
@@ -925,20 +990,18 @@
           <w:numId w:val="1"/>
         </w:numPr>
         <w:tabs>
-          <w:tab w:pos="964" w:val="left" w:leader="none"/>
+          <w:tab w:val="left" w:pos="964"/>
         </w:tabs>
-        <w:spacing w:line="176" w:lineRule="exact" w:before="0" w:after="0"/>
-        <w:ind w:left="964" w:right="0" w:hanging="192"/>
-        <w:jc w:val="left"/>
-        <w:rPr>
-          <w:sz w:val="16"/>
-        </w:rPr>
-      </w:pPr>
-      <w:r>
-        <w:rPr>
-          <w:sz w:val="16"/>
-        </w:rPr>
-        <w:t>Write </w:t>
+        <w:ind w:hanging="192"/>
+        <w:rPr>
+          <w:sz w:val="16"/>
+        </w:rPr>
+      </w:pPr>
+      <w:r>
+        <w:rPr>
+          <w:sz w:val="16"/>
+        </w:rPr>
+        <w:t xml:space="preserve">Write </w:t>
       </w:r>
       <w:r>
         <w:rPr>
@@ -956,21 +1019,21 @@
           <w:numId w:val="1"/>
         </w:numPr>
         <w:tabs>
-          <w:tab w:pos="964" w:val="left" w:leader="none"/>
+          <w:tab w:val="left" w:pos="964"/>
         </w:tabs>
-        <w:spacing w:line="179" w:lineRule="exact" w:before="0" w:after="0"/>
-        <w:ind w:left="964" w:right="0" w:hanging="192"/>
-        <w:jc w:val="left"/>
-        <w:rPr>
-          <w:sz w:val="16"/>
-        </w:rPr>
-      </w:pPr>
-      <w:r>
-        <w:rPr>
-          <w:sz w:val="16"/>
-        </w:rPr>
-        <w:t>CRUD operations using </w:t>
-      </w:r>
+        <w:spacing w:line="179" w:lineRule="exact"/>
+        <w:ind w:hanging="192"/>
+        <w:rPr>
+          <w:sz w:val="16"/>
+        </w:rPr>
+      </w:pPr>
+      <w:r>
+        <w:rPr>
+          <w:sz w:val="16"/>
+        </w:rPr>
+        <w:t xml:space="preserve">CRUD operations using </w:t>
+      </w:r>
+      <w:proofErr w:type="spellStart"/>
       <w:r>
         <w:rPr>
           <w:spacing w:val="-2"/>
@@ -978,11 +1041,12 @@
         </w:rPr>
         <w:t>System.Text.Json</w:t>
       </w:r>
-    </w:p>
-    <w:p>
-      <w:pPr>
-        <w:pStyle w:val="BodyText"/>
-        <w:spacing w:line="240" w:lineRule="auto" w:before="165"/>
+      <w:proofErr w:type="spellEnd"/>
+    </w:p>
+    <w:p>
+      <w:pPr>
+        <w:pStyle w:val="BodyText"/>
+        <w:spacing w:before="165" w:line="240" w:lineRule="auto"/>
         <w:ind w:left="0"/>
       </w:pPr>
     </w:p>
@@ -991,8 +1055,7 @@
         <w:pStyle w:val="Heading1"/>
       </w:pPr>
       <w:r>
-        <w:rPr/>
-        <w:t>PHASE 5: SERVICE </w:t>
+        <w:t xml:space="preserve">PHASE 5: SERVICE </w:t>
       </w:r>
       <w:r>
         <w:rPr>
@@ -1009,20 +1072,18 @@
           <w:numId w:val="1"/>
         </w:numPr>
         <w:tabs>
-          <w:tab w:pos="772" w:val="left" w:leader="none"/>
+          <w:tab w:val="left" w:pos="772"/>
         </w:tabs>
-        <w:spacing w:line="176" w:lineRule="exact" w:before="0" w:after="0"/>
-        <w:ind w:left="772" w:right="0" w:hanging="192"/>
-        <w:jc w:val="left"/>
-        <w:rPr>
-          <w:sz w:val="16"/>
-        </w:rPr>
-      </w:pPr>
-      <w:r>
-        <w:rPr>
-          <w:sz w:val="16"/>
-        </w:rPr>
-        <w:t>Business </w:t>
+        <w:ind w:hanging="192"/>
+        <w:rPr>
+          <w:sz w:val="16"/>
+        </w:rPr>
+      </w:pPr>
+      <w:r>
+        <w:rPr>
+          <w:sz w:val="16"/>
+        </w:rPr>
+        <w:t xml:space="preserve">Business </w:t>
       </w:r>
       <w:r>
         <w:rPr>
@@ -1040,11 +1101,9 @@
           <w:numId w:val="1"/>
         </w:numPr>
         <w:tabs>
-          <w:tab w:pos="964" w:val="left" w:leader="none"/>
+          <w:tab w:val="left" w:pos="964"/>
         </w:tabs>
-        <w:spacing w:line="176" w:lineRule="exact" w:before="0" w:after="0"/>
-        <w:ind w:left="964" w:right="0" w:hanging="192"/>
-        <w:jc w:val="left"/>
+        <w:ind w:hanging="192"/>
         <w:rPr>
           <w:sz w:val="16"/>
         </w:rPr>
@@ -1065,20 +1124,18 @@
           <w:numId w:val="1"/>
         </w:numPr>
         <w:tabs>
-          <w:tab w:pos="964" w:val="left" w:leader="none"/>
+          <w:tab w:val="left" w:pos="964"/>
         </w:tabs>
-        <w:spacing w:line="176" w:lineRule="exact" w:before="0" w:after="0"/>
-        <w:ind w:left="964" w:right="0" w:hanging="192"/>
-        <w:jc w:val="left"/>
-        <w:rPr>
-          <w:sz w:val="16"/>
-        </w:rPr>
-      </w:pPr>
-      <w:r>
-        <w:rPr>
-          <w:sz w:val="16"/>
-        </w:rPr>
-        <w:t>Searching by </w:t>
+        <w:ind w:hanging="192"/>
+        <w:rPr>
+          <w:sz w:val="16"/>
+        </w:rPr>
+      </w:pPr>
+      <w:r>
+        <w:rPr>
+          <w:sz w:val="16"/>
+        </w:rPr>
+        <w:t xml:space="preserve">Searching by </w:t>
       </w:r>
       <w:r>
         <w:rPr>
@@ -1096,20 +1153,18 @@
           <w:numId w:val="1"/>
         </w:numPr>
         <w:tabs>
-          <w:tab w:pos="964" w:val="left" w:leader="none"/>
+          <w:tab w:val="left" w:pos="964"/>
         </w:tabs>
-        <w:spacing w:line="176" w:lineRule="exact" w:before="0" w:after="0"/>
-        <w:ind w:left="964" w:right="0" w:hanging="192"/>
-        <w:jc w:val="left"/>
-        <w:rPr>
-          <w:sz w:val="16"/>
-        </w:rPr>
-      </w:pPr>
-      <w:r>
-        <w:rPr>
-          <w:sz w:val="16"/>
-        </w:rPr>
-        <w:t>Mapping </w:t>
+        <w:ind w:hanging="192"/>
+        <w:rPr>
+          <w:sz w:val="16"/>
+        </w:rPr>
+      </w:pPr>
+      <w:r>
+        <w:rPr>
+          <w:sz w:val="16"/>
+        </w:rPr>
+        <w:t xml:space="preserve">Mapping </w:t>
       </w:r>
       <w:r>
         <w:rPr>
@@ -1127,20 +1182,19 @@
           <w:numId w:val="1"/>
         </w:numPr>
         <w:tabs>
-          <w:tab w:pos="964" w:val="left" w:leader="none"/>
+          <w:tab w:val="left" w:pos="964"/>
         </w:tabs>
-        <w:spacing w:line="179" w:lineRule="exact" w:before="0" w:after="0"/>
-        <w:ind w:left="964" w:right="0" w:hanging="192"/>
-        <w:jc w:val="left"/>
-        <w:rPr>
-          <w:sz w:val="16"/>
-        </w:rPr>
-      </w:pPr>
-      <w:r>
-        <w:rPr>
-          <w:sz w:val="16"/>
-        </w:rPr>
-        <w:t>Validation </w:t>
+        <w:spacing w:line="179" w:lineRule="exact"/>
+        <w:ind w:hanging="192"/>
+        <w:rPr>
+          <w:sz w:val="16"/>
+        </w:rPr>
+      </w:pPr>
+      <w:r>
+        <w:rPr>
+          <w:sz w:val="16"/>
+        </w:rPr>
+        <w:t xml:space="preserve">Validation </w:t>
       </w:r>
       <w:r>
         <w:rPr>
@@ -1153,7 +1207,7 @@
     <w:p>
       <w:pPr>
         <w:pStyle w:val="BodyText"/>
-        <w:spacing w:line="240" w:lineRule="auto" w:before="166"/>
+        <w:spacing w:before="166" w:line="240" w:lineRule="auto"/>
         <w:ind w:left="0"/>
       </w:pPr>
     </w:p>
@@ -1162,8 +1216,7 @@
         <w:pStyle w:val="Heading1"/>
       </w:pPr>
       <w:r>
-        <w:rPr/>
-        <w:t>PHASE 6: API </w:t>
+        <w:t xml:space="preserve">PHASE 6: API </w:t>
       </w:r>
       <w:r>
         <w:rPr>
@@ -1180,20 +1233,19 @@
           <w:numId w:val="1"/>
         </w:numPr>
         <w:tabs>
-          <w:tab w:pos="772" w:val="left" w:leader="none"/>
+          <w:tab w:val="left" w:pos="772"/>
         </w:tabs>
-        <w:spacing w:line="179" w:lineRule="exact" w:before="0" w:after="0"/>
-        <w:ind w:left="772" w:right="0" w:hanging="192"/>
-        <w:jc w:val="left"/>
-        <w:rPr>
-          <w:sz w:val="16"/>
-        </w:rPr>
-      </w:pPr>
-      <w:r>
-        <w:rPr>
-          <w:sz w:val="16"/>
-        </w:rPr>
-        <w:t>Create </w:t>
+        <w:spacing w:line="179" w:lineRule="exact"/>
+        <w:ind w:hanging="192"/>
+        <w:rPr>
+          <w:sz w:val="16"/>
+        </w:rPr>
+      </w:pPr>
+      <w:r>
+        <w:rPr>
+          <w:sz w:val="16"/>
+        </w:rPr>
+        <w:t xml:space="preserve">Create </w:t>
       </w:r>
       <w:r>
         <w:rPr>
@@ -1206,14 +1258,42 @@
     <w:p>
       <w:pPr>
         <w:pStyle w:val="BodyText"/>
-        <w:spacing w:line="232" w:lineRule="auto" w:before="175"/>
+        <w:spacing w:before="175" w:line="232" w:lineRule="auto"/>
         <w:ind w:left="580" w:right="4851"/>
       </w:pPr>
       <w:r>
         <w:rPr>
           <w:spacing w:val="-2"/>
         </w:rPr>
-        <w:t>[ApiController] [Route("api/[controller]")]</w:t>
+        <w:t>[</w:t>
+      </w:r>
+      <w:proofErr w:type="spellStart"/>
+      <w:r>
+        <w:rPr>
+          <w:spacing w:val="-2"/>
+        </w:rPr>
+        <w:t>ApiController</w:t>
+      </w:r>
+      <w:proofErr w:type="spellEnd"/>
+      <w:r>
+        <w:rPr>
+          <w:spacing w:val="-2"/>
+        </w:rPr>
+        <w:t>] [Route("</w:t>
+      </w:r>
+      <w:proofErr w:type="spellStart"/>
+      <w:r>
+        <w:rPr>
+          <w:spacing w:val="-2"/>
+        </w:rPr>
+        <w:t>api</w:t>
+      </w:r>
+      <w:proofErr w:type="spellEnd"/>
+      <w:r>
+        <w:rPr>
+          <w:spacing w:val="-2"/>
+        </w:rPr>
+        <w:t>/[controller]")]</w:t>
       </w:r>
     </w:p>
     <w:p>
@@ -1223,21 +1303,29 @@
         <w:ind w:left="580"/>
       </w:pPr>
       <w:r>
-        <w:rPr/>
-        <w:t>public class MedicineController : </w:t>
-      </w:r>
+        <w:t xml:space="preserve">public class </w:t>
+      </w:r>
+      <w:proofErr w:type="spellStart"/>
+      <w:r>
+        <w:t>MedicineController</w:t>
+      </w:r>
+      <w:proofErr w:type="spellEnd"/>
+      <w:r>
+        <w:t xml:space="preserve"> : </w:t>
+      </w:r>
+      <w:proofErr w:type="spellStart"/>
       <w:r>
         <w:rPr>
           <w:spacing w:val="-2"/>
         </w:rPr>
         <w:t>ControllerBase</w:t>
       </w:r>
-    </w:p>
-    <w:p>
-      <w:pPr>
-        <w:spacing w:line="173" w:lineRule="exact" w:before="0"/>
-        <w:ind w:left="580" w:right="0" w:firstLine="0"/>
-        <w:jc w:val="left"/>
+      <w:proofErr w:type="spellEnd"/>
+    </w:p>
+    <w:p>
+      <w:pPr>
+        <w:spacing w:line="173" w:lineRule="exact"/>
+        <w:ind w:left="580"/>
         <w:rPr>
           <w:sz w:val="16"/>
         </w:rPr>
@@ -1257,8 +1345,15 @@
         <w:ind w:left="964"/>
       </w:pPr>
       <w:r>
-        <w:rPr/>
-        <w:t>private readonly IMedicineService </w:t>
+        <w:t xml:space="preserve">private readonly </w:t>
+      </w:r>
+      <w:proofErr w:type="spellStart"/>
+      <w:r>
+        <w:t>IMedicineService</w:t>
+      </w:r>
+      <w:proofErr w:type="spellEnd"/>
+      <w:r>
+        <w:t xml:space="preserve"> </w:t>
       </w:r>
       <w:r>
         <w:rPr>
@@ -1274,8 +1369,23 @@
         <w:ind w:left="964"/>
       </w:pPr>
       <w:r>
-        <w:rPr/>
-        <w:t>public MedicineController(IMedicineService </w:t>
+        <w:t xml:space="preserve">public </w:t>
+      </w:r>
+      <w:proofErr w:type="spellStart"/>
+      <w:r>
+        <w:t>MedicineController</w:t>
+      </w:r>
+      <w:proofErr w:type="spellEnd"/>
+      <w:r>
+        <w:t>(</w:t>
+      </w:r>
+      <w:proofErr w:type="spellStart"/>
+      <w:r>
+        <w:t>IMedicineService</w:t>
+      </w:r>
+      <w:proofErr w:type="spellEnd"/>
+      <w:r>
+        <w:t xml:space="preserve"> </w:t>
       </w:r>
       <w:r>
         <w:rPr>
@@ -1286,9 +1396,8 @@
     </w:p>
     <w:p>
       <w:pPr>
-        <w:spacing w:line="173" w:lineRule="exact" w:before="0"/>
-        <w:ind w:left="964" w:right="0" w:firstLine="0"/>
-        <w:jc w:val="left"/>
+        <w:spacing w:line="173" w:lineRule="exact"/>
+        <w:ind w:left="964"/>
         <w:rPr>
           <w:sz w:val="16"/>
         </w:rPr>
@@ -1307,8 +1416,7 @@
         <w:ind w:left="1348"/>
       </w:pPr>
       <w:r>
-        <w:rPr/>
-        <w:t>_service = </w:t>
+        <w:t xml:space="preserve">_service = </w:t>
       </w:r>
       <w:r>
         <w:rPr>
@@ -1319,9 +1427,8 @@
     </w:p>
     <w:p>
       <w:pPr>
-        <w:spacing w:line="179" w:lineRule="exact" w:before="0"/>
-        <w:ind w:left="964" w:right="0" w:firstLine="0"/>
-        <w:jc w:val="left"/>
+        <w:spacing w:line="179" w:lineRule="exact"/>
+        <w:ind w:left="964"/>
         <w:rPr>
           <w:sz w:val="16"/>
         </w:rPr>
@@ -1337,7 +1444,7 @@
     <w:p>
       <w:pPr>
         <w:pStyle w:val="BodyText"/>
-        <w:spacing w:line="240" w:lineRule="auto" w:before="171"/>
+        <w:spacing w:before="171" w:line="240" w:lineRule="auto"/>
         <w:ind w:left="964"/>
       </w:pPr>
       <w:r>
@@ -1350,11 +1457,12 @@
     <w:p>
       <w:pPr>
         <w:pStyle w:val="BodyText"/>
-        <w:spacing w:after="0" w:line="240" w:lineRule="auto"/>
+        <w:spacing w:line="240" w:lineRule="auto"/>
         <w:sectPr>
           <w:type w:val="continuous"/>
           <w:pgSz w:w="11910" w:h="16840"/>
-          <w:pgMar w:top="1480" w:bottom="280" w:left="1700" w:right="850"/>
+          <w:pgMar w:top="1480" w:right="850" w:bottom="280" w:left="1700" w:header="720" w:footer="720" w:gutter="0"/>
+          <w:cols w:space="720"/>
         </w:sectPr>
       </w:pPr>
     </w:p>
@@ -1365,8 +1473,24 @@
         <w:ind w:left="964"/>
       </w:pPr>
       <w:r>
-        <w:rPr/>
-        <w:t>public async Task&lt;IActionResult&gt; GetAll(string </w:t>
+        <w:lastRenderedPageBreak/>
+        <w:t>public async Task&lt;</w:t>
+      </w:r>
+      <w:proofErr w:type="spellStart"/>
+      <w:r>
+        <w:t>IActionResult</w:t>
+      </w:r>
+      <w:proofErr w:type="spellEnd"/>
+      <w:r>
+        <w:t xml:space="preserve">&gt; </w:t>
+      </w:r>
+      <w:proofErr w:type="spellStart"/>
+      <w:r>
+        <w:t>GetAll</w:t>
+      </w:r>
+      <w:proofErr w:type="spellEnd"/>
+      <w:r>
+        <w:t xml:space="preserve">(string </w:t>
       </w:r>
       <w:r>
         <w:rPr>
@@ -1377,9 +1501,8 @@
     </w:p>
     <w:p>
       <w:pPr>
-        <w:spacing w:line="173" w:lineRule="exact" w:before="0"/>
-        <w:ind w:left="964" w:right="0" w:firstLine="0"/>
-        <w:jc w:val="left"/>
+        <w:spacing w:line="173" w:lineRule="exact"/>
+        <w:ind w:left="964"/>
         <w:rPr>
           <w:sz w:val="16"/>
         </w:rPr>
@@ -1395,59 +1518,61 @@
     <w:p>
       <w:pPr>
         <w:pStyle w:val="BodyText"/>
-        <w:spacing w:line="232" w:lineRule="auto" w:before="4"/>
+        <w:spacing w:before="4" w:line="232" w:lineRule="auto"/>
         <w:ind w:left="1348" w:right="3075"/>
       </w:pPr>
       <w:r>
-        <w:rPr/>
         <w:t>var</w:t>
       </w:r>
       <w:r>
         <w:rPr>
           <w:spacing w:val="-9"/>
         </w:rPr>
-        <w:t> </w:t>
-      </w:r>
-      <w:r>
-        <w:rPr/>
+        <w:t xml:space="preserve"> </w:t>
+      </w:r>
+      <w:r>
         <w:t>data</w:t>
       </w:r>
       <w:r>
         <w:rPr>
           <w:spacing w:val="-9"/>
         </w:rPr>
-        <w:t> </w:t>
-      </w:r>
-      <w:r>
-        <w:rPr/>
+        <w:t xml:space="preserve"> </w:t>
+      </w:r>
+      <w:r>
         <w:t>=</w:t>
       </w:r>
       <w:r>
         <w:rPr>
           <w:spacing w:val="-9"/>
         </w:rPr>
-        <w:t> </w:t>
-      </w:r>
-      <w:r>
-        <w:rPr/>
+        <w:t xml:space="preserve"> </w:t>
+      </w:r>
+      <w:r>
         <w:t>await</w:t>
       </w:r>
       <w:r>
         <w:rPr>
           <w:spacing w:val="-9"/>
         </w:rPr>
-        <w:t> </w:t>
-      </w:r>
-      <w:r>
-        <w:rPr/>
-        <w:t>_service.GetAllAsync(search); return Ok(data);</w:t>
-      </w:r>
-    </w:p>
-    <w:p>
-      <w:pPr>
-        <w:spacing w:line="178" w:lineRule="exact" w:before="0"/>
-        <w:ind w:left="964" w:right="0" w:firstLine="0"/>
-        <w:jc w:val="left"/>
+        <w:t xml:space="preserve"> </w:t>
+      </w:r>
+      <w:r>
+        <w:t>_</w:t>
+      </w:r>
+      <w:proofErr w:type="spellStart"/>
+      <w:r>
+        <w:t>service.GetAllAsync</w:t>
+      </w:r>
+      <w:proofErr w:type="spellEnd"/>
+      <w:r>
+        <w:t>(search); return Ok(data);</w:t>
+      </w:r>
+    </w:p>
+    <w:p>
+      <w:pPr>
+        <w:spacing w:line="178" w:lineRule="exact"/>
+        <w:ind w:left="964"/>
         <w:rPr>
           <w:sz w:val="16"/>
         </w:rPr>
@@ -1470,7 +1595,21 @@
         <w:rPr>
           <w:spacing w:val="-2"/>
         </w:rPr>
-        <w:t>[HttpPost]</w:t>
+        <w:t>[</w:t>
+      </w:r>
+      <w:proofErr w:type="spellStart"/>
+      <w:r>
+        <w:rPr>
+          <w:spacing w:val="-2"/>
+        </w:rPr>
+        <w:t>HttpPost</w:t>
+      </w:r>
+      <w:proofErr w:type="spellEnd"/>
+      <w:r>
+        <w:rPr>
+          <w:spacing w:val="-2"/>
+        </w:rPr>
+        <w:t>]</w:t>
       </w:r>
     </w:p>
     <w:p>
@@ -1480,21 +1619,43 @@
         <w:ind w:left="964"/>
       </w:pPr>
       <w:r>
-        <w:rPr/>
-        <w:t>public async Task&lt;IActionResult&gt; Add(MedicineDto </w:t>
-      </w:r>
+        <w:t>public async Task&lt;</w:t>
+      </w:r>
+      <w:proofErr w:type="spellStart"/>
+      <w:r>
+        <w:t>IActionResult</w:t>
+      </w:r>
+      <w:proofErr w:type="spellEnd"/>
+      <w:r>
+        <w:t>&gt; Add(</w:t>
+      </w:r>
+      <w:proofErr w:type="spellStart"/>
+      <w:r>
+        <w:t>MedicineDto</w:t>
+      </w:r>
+      <w:proofErr w:type="spellEnd"/>
+      <w:r>
+        <w:t xml:space="preserve"> </w:t>
+      </w:r>
+      <w:proofErr w:type="spellStart"/>
       <w:r>
         <w:rPr>
           <w:spacing w:val="-4"/>
         </w:rPr>
-        <w:t>dto)</w:t>
-      </w:r>
-    </w:p>
-    <w:p>
-      <w:pPr>
-        <w:spacing w:line="173" w:lineRule="exact" w:before="0"/>
-        <w:ind w:left="964" w:right="0" w:firstLine="0"/>
-        <w:jc w:val="left"/>
+        <w:t>dto</w:t>
+      </w:r>
+      <w:proofErr w:type="spellEnd"/>
+      <w:r>
+        <w:rPr>
+          <w:spacing w:val="-4"/>
+        </w:rPr>
+        <w:t>)</w:t>
+      </w:r>
+    </w:p>
+    <w:p>
+      <w:pPr>
+        <w:spacing w:line="173" w:lineRule="exact"/>
+        <w:ind w:left="964"/>
         <w:rPr>
           <w:sz w:val="16"/>
         </w:rPr>
@@ -1510,39 +1671,51 @@
     <w:p>
       <w:pPr>
         <w:pStyle w:val="BodyText"/>
-        <w:spacing w:line="232" w:lineRule="auto" w:before="4"/>
+        <w:spacing w:before="4" w:line="232" w:lineRule="auto"/>
         <w:ind w:left="1348" w:right="4851"/>
       </w:pPr>
       <w:r>
-        <w:rPr/>
-        <w:t>await _service.AddAsync(dto); return</w:t>
+        <w:t>await _</w:t>
+      </w:r>
+      <w:proofErr w:type="spellStart"/>
+      <w:r>
+        <w:t>service.AddAsync</w:t>
+      </w:r>
+      <w:proofErr w:type="spellEnd"/>
+      <w:r>
+        <w:t>(</w:t>
+      </w:r>
+      <w:proofErr w:type="spellStart"/>
+      <w:r>
+        <w:t>dto</w:t>
+      </w:r>
+      <w:proofErr w:type="spellEnd"/>
+      <w:r>
+        <w:t>); return</w:t>
       </w:r>
       <w:r>
         <w:rPr>
           <w:spacing w:val="-17"/>
         </w:rPr>
-        <w:t> </w:t>
-      </w:r>
-      <w:r>
-        <w:rPr/>
+        <w:t xml:space="preserve"> </w:t>
+      </w:r>
+      <w:r>
         <w:t>Ok("Added</w:t>
       </w:r>
       <w:r>
         <w:rPr>
           <w:spacing w:val="-17"/>
         </w:rPr>
-        <w:t> </w:t>
-      </w:r>
-      <w:r>
-        <w:rPr/>
+        <w:t xml:space="preserve"> </w:t>
+      </w:r>
+      <w:r>
         <w:t>successfully");</w:t>
       </w:r>
     </w:p>
     <w:p>
       <w:pPr>
-        <w:spacing w:line="175" w:lineRule="exact" w:before="0"/>
-        <w:ind w:left="964" w:right="0" w:firstLine="0"/>
-        <w:jc w:val="left"/>
+        <w:spacing w:line="175" w:lineRule="exact"/>
+        <w:ind w:left="964"/>
         <w:rPr>
           <w:sz w:val="16"/>
         </w:rPr>
@@ -1557,9 +1730,8 @@
     </w:p>
     <w:p>
       <w:pPr>
-        <w:spacing w:line="179" w:lineRule="exact" w:before="0"/>
-        <w:ind w:left="580" w:right="0" w:firstLine="0"/>
-        <w:jc w:val="left"/>
+        <w:spacing w:line="179" w:lineRule="exact"/>
+        <w:ind w:left="580"/>
         <w:rPr>
           <w:sz w:val="16"/>
         </w:rPr>
@@ -1575,7 +1747,7 @@
     <w:p>
       <w:pPr>
         <w:pStyle w:val="BodyText"/>
-        <w:spacing w:line="240" w:lineRule="auto" w:before="166"/>
+        <w:spacing w:before="166" w:line="240" w:lineRule="auto"/>
         <w:ind w:left="0"/>
       </w:pPr>
     </w:p>
@@ -1584,8 +1756,7 @@
         <w:pStyle w:val="Heading1"/>
       </w:pPr>
       <w:r>
-        <w:rPr/>
-        <w:t>PHASE 7: </w:t>
+        <w:t xml:space="preserve">PHASE 7: </w:t>
       </w:r>
       <w:r>
         <w:rPr>
@@ -1602,20 +1773,18 @@
           <w:numId w:val="1"/>
         </w:numPr>
         <w:tabs>
-          <w:tab w:pos="772" w:val="left" w:leader="none"/>
+          <w:tab w:val="left" w:pos="772"/>
         </w:tabs>
-        <w:spacing w:line="176" w:lineRule="exact" w:before="0" w:after="0"/>
-        <w:ind w:left="772" w:right="0" w:hanging="192"/>
-        <w:jc w:val="left"/>
-        <w:rPr>
-          <w:sz w:val="16"/>
-        </w:rPr>
-      </w:pPr>
-      <w:r>
-        <w:rPr>
-          <w:sz w:val="16"/>
-        </w:rPr>
-        <w:t>Dependency </w:t>
+        <w:ind w:hanging="192"/>
+        <w:rPr>
+          <w:sz w:val="16"/>
+        </w:rPr>
+      </w:pPr>
+      <w:r>
+        <w:rPr>
+          <w:sz w:val="16"/>
+        </w:rPr>
+        <w:t xml:space="preserve">Dependency </w:t>
       </w:r>
       <w:r>
         <w:rPr>
@@ -1633,20 +1802,18 @@
           <w:numId w:val="1"/>
         </w:numPr>
         <w:tabs>
-          <w:tab w:pos="772" w:val="left" w:leader="none"/>
+          <w:tab w:val="left" w:pos="772"/>
         </w:tabs>
-        <w:spacing w:line="176" w:lineRule="exact" w:before="0" w:after="0"/>
-        <w:ind w:left="772" w:right="0" w:hanging="192"/>
-        <w:jc w:val="left"/>
-        <w:rPr>
-          <w:sz w:val="16"/>
-        </w:rPr>
-      </w:pPr>
-      <w:r>
-        <w:rPr>
-          <w:sz w:val="16"/>
-        </w:rPr>
-        <w:t>CORS </w:t>
+        <w:ind w:hanging="192"/>
+        <w:rPr>
+          <w:sz w:val="16"/>
+        </w:rPr>
+      </w:pPr>
+      <w:r>
+        <w:rPr>
+          <w:sz w:val="16"/>
+        </w:rPr>
+        <w:t xml:space="preserve">CORS </w:t>
       </w:r>
       <w:r>
         <w:rPr>
@@ -1664,20 +1831,18 @@
           <w:numId w:val="1"/>
         </w:numPr>
         <w:tabs>
-          <w:tab w:pos="772" w:val="left" w:leader="none"/>
+          <w:tab w:val="left" w:pos="772"/>
         </w:tabs>
-        <w:spacing w:line="176" w:lineRule="exact" w:before="0" w:after="0"/>
-        <w:ind w:left="772" w:right="0" w:hanging="192"/>
-        <w:jc w:val="left"/>
-        <w:rPr>
-          <w:sz w:val="16"/>
-        </w:rPr>
-      </w:pPr>
-      <w:r>
-        <w:rPr>
-          <w:sz w:val="16"/>
-        </w:rPr>
-        <w:t>Exception </w:t>
+        <w:ind w:hanging="192"/>
+        <w:rPr>
+          <w:sz w:val="16"/>
+        </w:rPr>
+      </w:pPr>
+      <w:r>
+        <w:rPr>
+          <w:sz w:val="16"/>
+        </w:rPr>
+        <w:t xml:space="preserve">Exception </w:t>
       </w:r>
       <w:r>
         <w:rPr>
@@ -1695,20 +1860,19 @@
           <w:numId w:val="1"/>
         </w:numPr>
         <w:tabs>
-          <w:tab w:pos="772" w:val="left" w:leader="none"/>
+          <w:tab w:val="left" w:pos="772"/>
         </w:tabs>
-        <w:spacing w:line="179" w:lineRule="exact" w:before="0" w:after="0"/>
-        <w:ind w:left="772" w:right="0" w:hanging="192"/>
-        <w:jc w:val="left"/>
-        <w:rPr>
-          <w:sz w:val="16"/>
-        </w:rPr>
-      </w:pPr>
-      <w:r>
-        <w:rPr>
-          <w:sz w:val="16"/>
-        </w:rPr>
-        <w:t>Proper Status </w:t>
+        <w:spacing w:line="179" w:lineRule="exact"/>
+        <w:ind w:hanging="192"/>
+        <w:rPr>
+          <w:sz w:val="16"/>
+        </w:rPr>
+      </w:pPr>
+      <w:r>
+        <w:rPr>
+          <w:sz w:val="16"/>
+        </w:rPr>
+        <w:t xml:space="preserve">Proper Status </w:t>
       </w:r>
       <w:r>
         <w:rPr>
@@ -1721,7 +1885,7 @@
     <w:p>
       <w:pPr>
         <w:pStyle w:val="BodyText"/>
-        <w:spacing w:line="240" w:lineRule="auto" w:before="165"/>
+        <w:spacing w:before="165" w:line="240" w:lineRule="auto"/>
         <w:ind w:left="0"/>
       </w:pPr>
     </w:p>
@@ -1731,8 +1895,7 @@
         <w:spacing w:line="240" w:lineRule="auto"/>
       </w:pPr>
       <w:r>
-        <w:rPr/>
-        <w:t>PHASE 8: REACT </w:t>
+        <w:t xml:space="preserve">PHASE 8: REACT </w:t>
       </w:r>
       <w:r>
         <w:rPr>
@@ -1748,8 +1911,7 @@
         <w:ind w:left="580"/>
       </w:pPr>
       <w:r>
-        <w:rPr/>
-        <w:t>Folder </w:t>
+        <w:t xml:space="preserve">Folder </w:t>
       </w:r>
       <w:r>
         <w:rPr>
@@ -1761,7 +1923,7 @@
     <w:p>
       <w:pPr>
         <w:pStyle w:val="BodyText"/>
-        <w:spacing w:line="232" w:lineRule="auto" w:before="2"/>
+        <w:spacing w:before="2" w:line="232" w:lineRule="auto"/>
         <w:ind w:right="5228" w:hanging="193"/>
       </w:pPr>
       <w:r>
@@ -1770,11 +1932,33 @@
         </w:rPr>
         <w:t>medicine-management-</w:t>
       </w:r>
-      <w:r>
-        <w:rPr>
-          <w:spacing w:val="-2"/>
-        </w:rPr>
-        <w:t>ui/ src/components/</w:t>
+      <w:proofErr w:type="spellStart"/>
+      <w:r>
+        <w:rPr>
+          <w:spacing w:val="-2"/>
+        </w:rPr>
+        <w:t>ui</w:t>
+      </w:r>
+      <w:proofErr w:type="spellEnd"/>
+      <w:r>
+        <w:rPr>
+          <w:spacing w:val="-2"/>
+        </w:rPr>
+        <w:t xml:space="preserve">/ </w:t>
+      </w:r>
+      <w:proofErr w:type="spellStart"/>
+      <w:r>
+        <w:rPr>
+          <w:spacing w:val="-2"/>
+        </w:rPr>
+        <w:t>src</w:t>
+      </w:r>
+      <w:proofErr w:type="spellEnd"/>
+      <w:r>
+        <w:rPr>
+          <w:spacing w:val="-2"/>
+        </w:rPr>
+        <w:t>/components/</w:t>
       </w:r>
     </w:p>
     <w:p>
@@ -1785,11 +1969,10 @@
           <w:numId w:val="1"/>
         </w:numPr>
         <w:tabs>
-          <w:tab w:pos="1156" w:val="left" w:leader="none"/>
+          <w:tab w:val="left" w:pos="1156"/>
         </w:tabs>
-        <w:spacing w:line="175" w:lineRule="exact" w:before="0" w:after="0"/>
-        <w:ind w:left="1156" w:right="0" w:hanging="192"/>
-        <w:jc w:val="left"/>
+        <w:spacing w:line="175" w:lineRule="exact"/>
+        <w:ind w:left="1156" w:hanging="192"/>
         <w:rPr>
           <w:sz w:val="16"/>
         </w:rPr>
@@ -1810,11 +1993,9 @@
           <w:numId w:val="1"/>
         </w:numPr>
         <w:tabs>
-          <w:tab w:pos="1156" w:val="left" w:leader="none"/>
+          <w:tab w:val="left" w:pos="1156"/>
         </w:tabs>
-        <w:spacing w:line="176" w:lineRule="exact" w:before="0" w:after="0"/>
-        <w:ind w:left="1156" w:right="0" w:hanging="192"/>
-        <w:jc w:val="left"/>
+        <w:ind w:left="1156" w:hanging="192"/>
         <w:rPr>
           <w:sz w:val="16"/>
         </w:rPr>
@@ -1835,11 +2016,10 @@
           <w:numId w:val="1"/>
         </w:numPr>
         <w:tabs>
-          <w:tab w:pos="1156" w:val="left" w:leader="none"/>
+          <w:tab w:val="left" w:pos="1156"/>
         </w:tabs>
-        <w:spacing w:line="179" w:lineRule="exact" w:before="0" w:after="0"/>
-        <w:ind w:left="1156" w:right="0" w:hanging="192"/>
-        <w:jc w:val="left"/>
+        <w:spacing w:line="179" w:lineRule="exact"/>
+        <w:ind w:left="1156" w:hanging="192"/>
         <w:rPr>
           <w:sz w:val="16"/>
         </w:rPr>
@@ -1859,11 +2039,19 @@
         <w:ind w:left="0" w:right="7621"/>
         <w:jc w:val="right"/>
       </w:pPr>
-      <w:r>
-        <w:rPr>
-          <w:spacing w:val="-2"/>
-        </w:rPr>
-        <w:t>src/pages/</w:t>
+      <w:proofErr w:type="spellStart"/>
+      <w:r>
+        <w:rPr>
+          <w:spacing w:val="-2"/>
+        </w:rPr>
+        <w:t>src</w:t>
+      </w:r>
+      <w:proofErr w:type="spellEnd"/>
+      <w:r>
+        <w:rPr>
+          <w:spacing w:val="-2"/>
+        </w:rPr>
+        <w:t>/pages/</w:t>
       </w:r>
     </w:p>
     <w:p>
@@ -1874,9 +2062,9 @@
           <w:numId w:val="1"/>
         </w:numPr>
         <w:tabs>
-          <w:tab w:pos="192" w:val="left" w:leader="none"/>
+          <w:tab w:val="left" w:pos="192"/>
         </w:tabs>
-        <w:spacing w:line="179" w:lineRule="exact" w:before="0" w:after="0"/>
+        <w:spacing w:line="179" w:lineRule="exact"/>
         <w:ind w:left="192" w:right="7525" w:hanging="192"/>
         <w:jc w:val="right"/>
         <w:rPr>
@@ -1898,11 +2086,19 @@
         <w:ind w:left="0" w:right="6561"/>
         <w:jc w:val="center"/>
       </w:pPr>
-      <w:r>
-        <w:rPr>
-          <w:spacing w:val="-2"/>
-        </w:rPr>
-        <w:t>src/services/</w:t>
+      <w:proofErr w:type="spellStart"/>
+      <w:r>
+        <w:rPr>
+          <w:spacing w:val="-2"/>
+        </w:rPr>
+        <w:t>src</w:t>
+      </w:r>
+      <w:proofErr w:type="spellEnd"/>
+      <w:r>
+        <w:rPr>
+          <w:spacing w:val="-2"/>
+        </w:rPr>
+        <w:t>/services/</w:t>
       </w:r>
     </w:p>
     <w:p>
@@ -1913,9 +2109,9 @@
           <w:numId w:val="1"/>
         </w:numPr>
         <w:tabs>
-          <w:tab w:pos="192" w:val="left" w:leader="none"/>
+          <w:tab w:val="left" w:pos="192"/>
         </w:tabs>
-        <w:spacing w:line="179" w:lineRule="exact" w:before="0" w:after="0"/>
+        <w:spacing w:line="179" w:lineRule="exact"/>
         <w:ind w:left="192" w:right="6657" w:hanging="192"/>
         <w:jc w:val="center"/>
         <w:rPr>
@@ -1935,11 +2131,19 @@
         <w:pStyle w:val="BodyText"/>
         <w:spacing w:before="171"/>
       </w:pPr>
-      <w:r>
-        <w:rPr>
-          <w:spacing w:val="-2"/>
-        </w:rPr>
-        <w:t>src/routes/</w:t>
+      <w:proofErr w:type="spellStart"/>
+      <w:r>
+        <w:rPr>
+          <w:spacing w:val="-2"/>
+        </w:rPr>
+        <w:t>src</w:t>
+      </w:r>
+      <w:proofErr w:type="spellEnd"/>
+      <w:r>
+        <w:rPr>
+          <w:spacing w:val="-2"/>
+        </w:rPr>
+        <w:t>/routes/</w:t>
       </w:r>
     </w:p>
     <w:p>
@@ -1950,11 +2154,10 @@
           <w:numId w:val="1"/>
         </w:numPr>
         <w:tabs>
-          <w:tab w:pos="1156" w:val="left" w:leader="none"/>
+          <w:tab w:val="left" w:pos="1156"/>
         </w:tabs>
-        <w:spacing w:line="179" w:lineRule="exact" w:before="0" w:after="0"/>
-        <w:ind w:left="1156" w:right="0" w:hanging="192"/>
-        <w:jc w:val="left"/>
+        <w:spacing w:line="179" w:lineRule="exact"/>
+        <w:ind w:left="1156" w:hanging="192"/>
         <w:rPr>
           <w:sz w:val="16"/>
         </w:rPr>
@@ -1972,11 +2175,19 @@
         <w:pStyle w:val="BodyText"/>
         <w:spacing w:before="171"/>
       </w:pPr>
-      <w:r>
-        <w:rPr>
-          <w:spacing w:val="-2"/>
-        </w:rPr>
-        <w:t>src/utils/</w:t>
+      <w:proofErr w:type="spellStart"/>
+      <w:r>
+        <w:rPr>
+          <w:spacing w:val="-2"/>
+        </w:rPr>
+        <w:t>src</w:t>
+      </w:r>
+      <w:proofErr w:type="spellEnd"/>
+      <w:r>
+        <w:rPr>
+          <w:spacing w:val="-2"/>
+        </w:rPr>
+        <w:t>/utils/</w:t>
       </w:r>
     </w:p>
     <w:p>
@@ -1987,11 +2198,10 @@
           <w:numId w:val="1"/>
         </w:numPr>
         <w:tabs>
-          <w:tab w:pos="1156" w:val="left" w:leader="none"/>
+          <w:tab w:val="left" w:pos="1156"/>
         </w:tabs>
-        <w:spacing w:line="179" w:lineRule="exact" w:before="0" w:after="0"/>
-        <w:ind w:left="1156" w:right="0" w:hanging="192"/>
-        <w:jc w:val="left"/>
+        <w:spacing w:line="179" w:lineRule="exact"/>
+        <w:ind w:left="1156" w:hanging="192"/>
         <w:rPr>
           <w:sz w:val="16"/>
         </w:rPr>
@@ -2025,20 +2235,18 @@
           <w:numId w:val="1"/>
         </w:numPr>
         <w:tabs>
-          <w:tab w:pos="772" w:val="left" w:leader="none"/>
+          <w:tab w:val="left" w:pos="772"/>
         </w:tabs>
-        <w:spacing w:line="176" w:lineRule="exact" w:before="0" w:after="0"/>
-        <w:ind w:left="772" w:right="0" w:hanging="192"/>
-        <w:jc w:val="left"/>
-        <w:rPr>
-          <w:sz w:val="16"/>
-        </w:rPr>
-      </w:pPr>
-      <w:r>
-        <w:rPr>
-          <w:sz w:val="16"/>
-        </w:rPr>
-        <w:t>Axios API </w:t>
+        <w:ind w:hanging="192"/>
+        <w:rPr>
+          <w:sz w:val="16"/>
+        </w:rPr>
+      </w:pPr>
+      <w:r>
+        <w:rPr>
+          <w:sz w:val="16"/>
+        </w:rPr>
+        <w:t xml:space="preserve">Axios API </w:t>
       </w:r>
       <w:r>
         <w:rPr>
@@ -2056,20 +2264,18 @@
           <w:numId w:val="1"/>
         </w:numPr>
         <w:tabs>
-          <w:tab w:pos="772" w:val="left" w:leader="none"/>
+          <w:tab w:val="left" w:pos="772"/>
         </w:tabs>
-        <w:spacing w:line="176" w:lineRule="exact" w:before="0" w:after="0"/>
-        <w:ind w:left="772" w:right="0" w:hanging="192"/>
-        <w:jc w:val="left"/>
-        <w:rPr>
-          <w:sz w:val="16"/>
-        </w:rPr>
-      </w:pPr>
-      <w:r>
-        <w:rPr>
-          <w:sz w:val="16"/>
-        </w:rPr>
-        <w:t>Async/Await </w:t>
+        <w:ind w:hanging="192"/>
+        <w:rPr>
+          <w:sz w:val="16"/>
+        </w:rPr>
+      </w:pPr>
+      <w:r>
+        <w:rPr>
+          <w:sz w:val="16"/>
+        </w:rPr>
+        <w:t xml:space="preserve">Async/Await </w:t>
       </w:r>
       <w:r>
         <w:rPr>
@@ -2087,20 +2293,18 @@
           <w:numId w:val="1"/>
         </w:numPr>
         <w:tabs>
-          <w:tab w:pos="772" w:val="left" w:leader="none"/>
+          <w:tab w:val="left" w:pos="772"/>
         </w:tabs>
-        <w:spacing w:line="176" w:lineRule="exact" w:before="0" w:after="0"/>
-        <w:ind w:left="772" w:right="0" w:hanging="192"/>
-        <w:jc w:val="left"/>
-        <w:rPr>
-          <w:sz w:val="16"/>
-        </w:rPr>
-      </w:pPr>
-      <w:r>
-        <w:rPr>
-          <w:sz w:val="16"/>
-        </w:rPr>
-        <w:t>Routing </w:t>
+        <w:ind w:hanging="192"/>
+        <w:rPr>
+          <w:sz w:val="16"/>
+        </w:rPr>
+      </w:pPr>
+      <w:r>
+        <w:rPr>
+          <w:sz w:val="16"/>
+        </w:rPr>
+        <w:t xml:space="preserve">Routing </w:t>
       </w:r>
       <w:r>
         <w:rPr>
@@ -2118,20 +2322,19 @@
           <w:numId w:val="1"/>
         </w:numPr>
         <w:tabs>
-          <w:tab w:pos="772" w:val="left" w:leader="none"/>
+          <w:tab w:val="left" w:pos="772"/>
         </w:tabs>
-        <w:spacing w:line="179" w:lineRule="exact" w:before="0" w:after="0"/>
-        <w:ind w:left="772" w:right="0" w:hanging="192"/>
-        <w:jc w:val="left"/>
-        <w:rPr>
-          <w:sz w:val="16"/>
-        </w:rPr>
-      </w:pPr>
-      <w:r>
-        <w:rPr>
-          <w:sz w:val="16"/>
-        </w:rPr>
-        <w:t>State management </w:t>
+        <w:spacing w:line="179" w:lineRule="exact"/>
+        <w:ind w:hanging="192"/>
+        <w:rPr>
+          <w:sz w:val="16"/>
+        </w:rPr>
+      </w:pPr>
+      <w:r>
+        <w:rPr>
+          <w:sz w:val="16"/>
+        </w:rPr>
+        <w:t xml:space="preserve">State management </w:t>
       </w:r>
       <w:r>
         <w:rPr>
@@ -2144,7 +2347,7 @@
     <w:p>
       <w:pPr>
         <w:pStyle w:val="BodyText"/>
-        <w:spacing w:line="240" w:lineRule="auto" w:before="166"/>
+        <w:spacing w:before="166" w:line="240" w:lineRule="auto"/>
         <w:ind w:left="0"/>
       </w:pPr>
     </w:p>
@@ -2154,8 +2357,7 @@
         <w:spacing w:line="240" w:lineRule="auto"/>
       </w:pPr>
       <w:r>
-        <w:rPr/>
-        <w:t>PHASE 9: RUN </w:t>
+        <w:t xml:space="preserve">PHASE 9: RUN </w:t>
       </w:r>
       <w:r>
         <w:rPr>
@@ -2183,15 +2385,16 @@
         <w:ind w:left="580"/>
       </w:pPr>
       <w:r>
-        <w:rPr/>
-        <w:t>dotnet run --project </w:t>
-      </w:r>
+        <w:t xml:space="preserve">dotnet run --project </w:t>
+      </w:r>
+      <w:proofErr w:type="spellStart"/>
       <w:r>
         <w:rPr>
           <w:spacing w:val="-2"/>
         </w:rPr>
         <w:t>ABCPharmacy.API</w:t>
       </w:r>
+      <w:proofErr w:type="spellEnd"/>
     </w:p>
     <w:p>
       <w:pPr>
@@ -2211,9 +2414,13 @@
         <w:pStyle w:val="BodyText"/>
         <w:ind w:left="580"/>
       </w:pPr>
-      <w:r>
-        <w:rPr/>
-        <w:t>npm </w:t>
+      <w:proofErr w:type="spellStart"/>
+      <w:r>
+        <w:t>npm</w:t>
+      </w:r>
+      <w:proofErr w:type="spellEnd"/>
+      <w:r>
+        <w:t xml:space="preserve"> </w:t>
       </w:r>
       <w:r>
         <w:rPr>
@@ -2225,7 +2432,7 @@
     <w:p>
       <w:pPr>
         <w:pStyle w:val="BodyText"/>
-        <w:spacing w:line="240" w:lineRule="auto" w:before="166"/>
+        <w:spacing w:before="166" w:line="240" w:lineRule="auto"/>
         <w:ind w:left="0"/>
       </w:pPr>
     </w:p>
@@ -2234,8 +2441,7 @@
         <w:pStyle w:val="Heading1"/>
       </w:pPr>
       <w:r>
-        <w:rPr/>
-        <w:t>FINAL </w:t>
+        <w:t xml:space="preserve">FINAL </w:t>
       </w:r>
       <w:r>
         <w:rPr>
@@ -2248,10 +2454,12 @@
       <w:pPr>
         <w:pStyle w:val="BodyText"/>
         <w:ind w:left="580"/>
-      </w:pPr>
-      <w:r>
-        <w:rPr/>
-        <w:t>React UI -&gt; Web API -&gt; Service Layer -&gt; Repository Layer -&gt; JSON </w:t>
+        <w:rPr>
+          <w:spacing w:val="-2"/>
+        </w:rPr>
+      </w:pPr>
+      <w:r>
+        <w:t xml:space="preserve">React UI -&gt; Web API -&gt; Service Layer -&gt; Repository Layer -&gt; JSON </w:t>
       </w:r>
       <w:r>
         <w:rPr>
@@ -2259,21 +2467,873 @@
         </w:rPr>
         <w:t>Storage</w:t>
       </w:r>
+    </w:p>
+    <w:p>
+      <w:pPr>
+        <w:pStyle w:val="BodyText"/>
+        <w:ind w:left="580"/>
+        <w:rPr>
+          <w:spacing w:val="-2"/>
+        </w:rPr>
+      </w:pPr>
+    </w:p>
+    <w:p>
+      <w:pPr>
+        <w:pStyle w:val="BodyText"/>
+        <w:ind w:left="580"/>
+        <w:rPr>
+          <w:spacing w:val="-2"/>
+        </w:rPr>
+      </w:pPr>
+    </w:p>
+    <w:p>
+      <w:pPr>
+        <w:pStyle w:val="BodyText"/>
+        <w:ind w:left="580"/>
+        <w:rPr>
+          <w:spacing w:val="-2"/>
+        </w:rPr>
+      </w:pPr>
+    </w:p>
+    <w:p>
+      <w:pPr>
+        <w:pStyle w:val="BodyText"/>
+        <w:ind w:left="580"/>
+        <w:rPr>
+          <w:spacing w:val="-2"/>
+        </w:rPr>
+      </w:pPr>
+    </w:p>
+    <w:p>
+      <w:pPr>
+        <w:pStyle w:val="BodyText"/>
+        <w:ind w:left="580"/>
+        <w:rPr>
+          <w:b/>
+          <w:bCs/>
+          <w:spacing w:val="-2"/>
+        </w:rPr>
+      </w:pPr>
+    </w:p>
+    <w:p>
+      <w:pPr>
+        <w:pStyle w:val="BodyText"/>
+        <w:ind w:left="580"/>
+        <w:rPr>
+          <w:b/>
+          <w:bCs/>
+          <w:spacing w:val="-2"/>
+        </w:rPr>
+      </w:pPr>
+    </w:p>
+    <w:p>
+      <w:pPr>
+        <w:pStyle w:val="BodyText"/>
+        <w:ind w:left="580"/>
+        <w:rPr>
+          <w:b/>
+          <w:bCs/>
+          <w:spacing w:val="-2"/>
+        </w:rPr>
+      </w:pPr>
+    </w:p>
+    <w:p>
+      <w:pPr>
+        <w:pStyle w:val="BodyText"/>
+        <w:ind w:left="580"/>
+        <w:rPr>
+          <w:b/>
+          <w:bCs/>
+          <w:spacing w:val="-2"/>
+        </w:rPr>
+      </w:pPr>
+    </w:p>
+    <w:p>
+      <w:pPr>
+        <w:pStyle w:val="BodyText"/>
+        <w:ind w:left="580"/>
+        <w:rPr>
+          <w:b/>
+          <w:bCs/>
+          <w:spacing w:val="-2"/>
+        </w:rPr>
+      </w:pPr>
+    </w:p>
+    <w:p>
+      <w:pPr>
+        <w:pStyle w:val="BodyText"/>
+        <w:ind w:left="580"/>
+        <w:rPr>
+          <w:b/>
+          <w:bCs/>
+          <w:spacing w:val="-2"/>
+        </w:rPr>
+      </w:pPr>
+    </w:p>
+    <w:p>
+      <w:pPr>
+        <w:pStyle w:val="BodyText"/>
+        <w:ind w:left="580"/>
+        <w:rPr>
+          <w:b/>
+          <w:bCs/>
+          <w:spacing w:val="-2"/>
+        </w:rPr>
+      </w:pPr>
+    </w:p>
+    <w:p>
+      <w:pPr>
+        <w:pStyle w:val="BodyText"/>
+        <w:ind w:left="580"/>
+        <w:rPr>
+          <w:b/>
+          <w:bCs/>
+          <w:spacing w:val="-2"/>
+        </w:rPr>
+      </w:pPr>
+    </w:p>
+    <w:p>
+      <w:pPr>
+        <w:pStyle w:val="BodyText"/>
+        <w:ind w:left="580"/>
+        <w:rPr>
+          <w:b/>
+          <w:bCs/>
+          <w:spacing w:val="-2"/>
+        </w:rPr>
+      </w:pPr>
+    </w:p>
+    <w:p>
+      <w:pPr>
+        <w:pStyle w:val="BodyText"/>
+        <w:ind w:left="580"/>
+        <w:rPr>
+          <w:b/>
+          <w:bCs/>
+          <w:spacing w:val="-2"/>
+        </w:rPr>
+      </w:pPr>
+    </w:p>
+    <w:p>
+      <w:pPr>
+        <w:pStyle w:val="BodyText"/>
+        <w:ind w:left="580"/>
+        <w:rPr>
+          <w:b/>
+          <w:bCs/>
+          <w:spacing w:val="-2"/>
+        </w:rPr>
+      </w:pPr>
+    </w:p>
+    <w:p>
+      <w:pPr>
+        <w:pStyle w:val="BodyText"/>
+        <w:ind w:left="580"/>
+        <w:rPr>
+          <w:b/>
+          <w:bCs/>
+          <w:spacing w:val="-2"/>
+        </w:rPr>
+      </w:pPr>
+    </w:p>
+    <w:p>
+      <w:pPr>
+        <w:pStyle w:val="BodyText"/>
+        <w:ind w:left="580"/>
+        <w:rPr>
+          <w:b/>
+          <w:bCs/>
+          <w:spacing w:val="-2"/>
+        </w:rPr>
+      </w:pPr>
+    </w:p>
+    <w:p>
+      <w:pPr>
+        <w:pStyle w:val="BodyText"/>
+        <w:ind w:left="580"/>
+        <w:rPr>
+          <w:b/>
+          <w:bCs/>
+          <w:spacing w:val="-2"/>
+        </w:rPr>
+      </w:pPr>
+    </w:p>
+    <w:p>
+      <w:pPr>
+        <w:pStyle w:val="BodyText"/>
+        <w:ind w:left="580"/>
+        <w:rPr>
+          <w:b/>
+          <w:bCs/>
+          <w:spacing w:val="-2"/>
+        </w:rPr>
+      </w:pPr>
+    </w:p>
+    <w:p>
+      <w:pPr>
+        <w:pStyle w:val="BodyText"/>
+        <w:ind w:left="580"/>
+        <w:rPr>
+          <w:b/>
+          <w:bCs/>
+          <w:spacing w:val="-2"/>
+        </w:rPr>
+      </w:pPr>
+    </w:p>
+    <w:p>
+      <w:pPr>
+        <w:pStyle w:val="BodyText"/>
+        <w:ind w:left="580"/>
+        <w:rPr>
+          <w:b/>
+          <w:bCs/>
+          <w:spacing w:val="-2"/>
+        </w:rPr>
+      </w:pPr>
+    </w:p>
+    <w:p>
+      <w:pPr>
+        <w:pStyle w:val="BodyText"/>
+        <w:ind w:left="580"/>
+        <w:rPr>
+          <w:b/>
+          <w:bCs/>
+          <w:spacing w:val="-2"/>
+        </w:rPr>
+      </w:pPr>
+    </w:p>
+    <w:p>
+      <w:pPr>
+        <w:pStyle w:val="BodyText"/>
+        <w:ind w:left="580"/>
+        <w:rPr>
+          <w:b/>
+          <w:bCs/>
+          <w:spacing w:val="-2"/>
+        </w:rPr>
+      </w:pPr>
+    </w:p>
+    <w:p>
+      <w:pPr>
+        <w:pStyle w:val="BodyText"/>
+        <w:ind w:left="580"/>
+        <w:rPr>
+          <w:b/>
+          <w:bCs/>
+          <w:spacing w:val="-2"/>
+        </w:rPr>
+      </w:pPr>
+    </w:p>
+    <w:p>
+      <w:pPr>
+        <w:pStyle w:val="BodyText"/>
+        <w:ind w:left="580"/>
+        <w:rPr>
+          <w:b/>
+          <w:bCs/>
+          <w:spacing w:val="-2"/>
+        </w:rPr>
+      </w:pPr>
+    </w:p>
+    <w:p>
+      <w:pPr>
+        <w:pStyle w:val="BodyText"/>
+        <w:ind w:left="580"/>
+        <w:rPr>
+          <w:b/>
+          <w:bCs/>
+          <w:spacing w:val="-2"/>
+        </w:rPr>
+      </w:pPr>
+    </w:p>
+    <w:p>
+      <w:pPr>
+        <w:pStyle w:val="BodyText"/>
+        <w:ind w:left="580"/>
+        <w:rPr>
+          <w:b/>
+          <w:bCs/>
+          <w:spacing w:val="-2"/>
+        </w:rPr>
+      </w:pPr>
+    </w:p>
+    <w:p>
+      <w:pPr>
+        <w:pStyle w:val="BodyText"/>
+        <w:ind w:left="580"/>
+        <w:rPr>
+          <w:b/>
+          <w:bCs/>
+          <w:spacing w:val="-2"/>
+        </w:rPr>
+      </w:pPr>
+    </w:p>
+    <w:p>
+      <w:pPr>
+        <w:pStyle w:val="BodyText"/>
+        <w:ind w:left="580"/>
+        <w:rPr>
+          <w:b/>
+          <w:bCs/>
+          <w:spacing w:val="-2"/>
+        </w:rPr>
+      </w:pPr>
+    </w:p>
+    <w:p>
+      <w:pPr>
+        <w:pStyle w:val="BodyText"/>
+        <w:ind w:left="580"/>
+        <w:rPr>
+          <w:b/>
+          <w:bCs/>
+          <w:spacing w:val="-2"/>
+        </w:rPr>
+      </w:pPr>
+    </w:p>
+    <w:p>
+      <w:pPr>
+        <w:pStyle w:val="BodyText"/>
+        <w:ind w:left="580"/>
+        <w:rPr>
+          <w:b/>
+          <w:bCs/>
+          <w:color w:val="EE0000"/>
+          <w:spacing w:val="-2"/>
+        </w:rPr>
+      </w:pPr>
+      <w:r>
+        <w:rPr>
+          <w:b/>
+          <w:bCs/>
+          <w:color w:val="EE0000"/>
+          <w:spacing w:val="-2"/>
+        </w:rPr>
+        <w:t>Implementation:</w:t>
+      </w:r>
+    </w:p>
+    <w:p>
+      <w:pPr>
+        <w:pStyle w:val="BodyText"/>
+        <w:ind w:left="580"/>
+        <w:rPr>
+          <w:b/>
+          <w:bCs/>
+          <w:color w:val="EE0000"/>
+          <w:spacing w:val="-2"/>
+        </w:rPr>
+      </w:pPr>
+    </w:p>
+    <w:p>
+      <w:pPr>
+        <w:pStyle w:val="Heading1"/>
+        <w:spacing w:before="170"/>
+        <w:rPr>
+          <w:b/>
+          <w:bCs/>
+          <w:spacing w:val="-2"/>
+        </w:rPr>
+      </w:pPr>
+      <w:r>
+        <w:rPr>
+          <w:b/>
+          <w:bCs/>
+        </w:rPr>
+        <w:t xml:space="preserve">PHASE 1: PROJECT </w:t>
+      </w:r>
+      <w:r>
+        <w:rPr>
+          <w:b/>
+          <w:bCs/>
+          <w:spacing w:val="-2"/>
+        </w:rPr>
+        <w:t>SETUP</w:t>
+      </w:r>
+      <w:r>
+        <w:rPr>
+          <w:b/>
+          <w:bCs/>
+          <w:spacing w:val="-2"/>
+        </w:rPr>
+        <w:t>:</w:t>
+      </w:r>
+    </w:p>
+    <w:p>
+      <w:pPr>
+        <w:pStyle w:val="BodyText"/>
+        <w:ind w:left="580"/>
+      </w:pPr>
+    </w:p>
+    <w:p>
+      <w:pPr>
+        <w:pStyle w:val="BodyText"/>
+        <w:ind w:left="580"/>
+        <w:rPr>
+          <w:b/>
+          <w:bCs/>
+        </w:rPr>
+      </w:pPr>
+      <w:r>
+        <w:rPr>
+          <w:b/>
+          <w:bCs/>
+        </w:rPr>
+        <w:t>STEP 1: Create Solution</w:t>
+      </w:r>
+    </w:p>
+    <w:p>
+      <w:pPr>
+        <w:pStyle w:val="BodyText"/>
+        <w:ind w:left="580"/>
+      </w:pPr>
+      <w:r>
+        <w:t xml:space="preserve">dotnet new </w:t>
+      </w:r>
+      <w:proofErr w:type="spellStart"/>
+      <w:r>
+        <w:t>sln</w:t>
+      </w:r>
+      <w:proofErr w:type="spellEnd"/>
+      <w:r>
+        <w:t xml:space="preserve"> -n </w:t>
+      </w:r>
+      <w:proofErr w:type="spellStart"/>
+      <w:r>
+        <w:t>ABCPharmacy</w:t>
+      </w:r>
+      <w:proofErr w:type="spellEnd"/>
+    </w:p>
+    <w:p>
+      <w:pPr>
+        <w:pStyle w:val="BodyText"/>
+        <w:ind w:left="580"/>
+      </w:pPr>
+    </w:p>
+    <w:p>
+      <w:pPr>
+        <w:pStyle w:val="BodyText"/>
+        <w:ind w:left="580"/>
+      </w:pPr>
+    </w:p>
+    <w:p>
+      <w:pPr>
+        <w:pStyle w:val="BodyText"/>
+        <w:ind w:left="580"/>
+        <w:rPr>
+          <w:b/>
+          <w:bCs/>
+        </w:rPr>
+      </w:pPr>
+      <w:r>
+        <w:rPr>
+          <w:b/>
+          <w:bCs/>
+        </w:rPr>
+        <w:t>STEP 2: Create Projects</w:t>
+      </w:r>
+    </w:p>
+    <w:p>
+      <w:pPr>
+        <w:pStyle w:val="BodyText"/>
+        <w:ind w:left="580"/>
+      </w:pPr>
+      <w:r>
+        <w:t xml:space="preserve">API </w:t>
+      </w:r>
+      <w:proofErr w:type="spellStart"/>
+      <w:r>
+        <w:t>Project</w:t>
+      </w:r>
+      <w:r>
+        <w:t>:</w:t>
+      </w:r>
+      <w:r>
+        <w:t>dotnet</w:t>
+      </w:r>
+      <w:proofErr w:type="spellEnd"/>
+      <w:r>
+        <w:t xml:space="preserve"> new </w:t>
+      </w:r>
+      <w:proofErr w:type="spellStart"/>
+      <w:r>
+        <w:t>webapi</w:t>
+      </w:r>
+      <w:proofErr w:type="spellEnd"/>
+      <w:r>
+        <w:t xml:space="preserve"> -n </w:t>
+      </w:r>
+      <w:proofErr w:type="spellStart"/>
+      <w:r>
+        <w:t>ABCPharmacy.API</w:t>
+      </w:r>
+      <w:proofErr w:type="spellEnd"/>
+    </w:p>
+    <w:p>
+      <w:pPr>
+        <w:pStyle w:val="BodyText"/>
+        <w:ind w:left="580"/>
+      </w:pPr>
+    </w:p>
+    <w:p>
+      <w:pPr>
+        <w:pStyle w:val="BodyText"/>
+        <w:ind w:left="580"/>
+      </w:pPr>
+      <w:r>
+        <w:t>Application Layer</w:t>
+      </w:r>
+      <w:r>
+        <w:t>:</w:t>
+      </w:r>
+      <w:r>
+        <w:rPr>
+          <w:sz w:val="22"/>
+          <w:szCs w:val="22"/>
+        </w:rPr>
+        <w:t xml:space="preserve"> </w:t>
+      </w:r>
+      <w:r>
+        <w:t xml:space="preserve">dotnet new </w:t>
+      </w:r>
+      <w:proofErr w:type="spellStart"/>
+      <w:r>
+        <w:t>classlib</w:t>
+      </w:r>
+      <w:proofErr w:type="spellEnd"/>
+      <w:r>
+        <w:t xml:space="preserve"> -n </w:t>
+      </w:r>
+      <w:proofErr w:type="spellStart"/>
+      <w:r>
+        <w:t>ABCPharmacy.Application</w:t>
+      </w:r>
+      <w:proofErr w:type="spellEnd"/>
+    </w:p>
+    <w:p>
+      <w:pPr>
+        <w:pStyle w:val="BodyText"/>
+        <w:ind w:left="580"/>
+      </w:pPr>
+    </w:p>
+    <w:p>
+      <w:pPr>
+        <w:pStyle w:val="BodyText"/>
+        <w:ind w:left="580"/>
+      </w:pPr>
+      <w:r>
+        <w:t>Domain Layer</w:t>
+      </w:r>
+      <w:r>
+        <w:t>:</w:t>
+      </w:r>
+      <w:r>
+        <w:rPr>
+          <w:sz w:val="22"/>
+          <w:szCs w:val="22"/>
+        </w:rPr>
+        <w:t xml:space="preserve"> </w:t>
+      </w:r>
+      <w:r>
+        <w:t xml:space="preserve">dotnet new </w:t>
+      </w:r>
+      <w:proofErr w:type="spellStart"/>
+      <w:r>
+        <w:t>classlib</w:t>
+      </w:r>
+      <w:proofErr w:type="spellEnd"/>
+      <w:r>
+        <w:t xml:space="preserve"> -n </w:t>
+      </w:r>
+      <w:proofErr w:type="spellStart"/>
+      <w:r>
+        <w:t>ABCPharmacy.Domain</w:t>
+      </w:r>
+      <w:proofErr w:type="spellEnd"/>
+    </w:p>
+    <w:p>
+      <w:pPr>
+        <w:pStyle w:val="BodyText"/>
+        <w:ind w:left="580"/>
+      </w:pPr>
+    </w:p>
+    <w:p>
+      <w:pPr>
+        <w:pStyle w:val="BodyText"/>
+        <w:ind w:left="580"/>
+      </w:pPr>
+      <w:r>
+        <w:t>Infrastructure Layer</w:t>
+      </w:r>
+      <w:r>
+        <w:t>:</w:t>
+      </w:r>
+      <w:r>
+        <w:rPr>
+          <w:sz w:val="22"/>
+          <w:szCs w:val="22"/>
+        </w:rPr>
+        <w:t xml:space="preserve"> </w:t>
+      </w:r>
+      <w:r>
+        <w:t xml:space="preserve">dotnet new </w:t>
+      </w:r>
+      <w:proofErr w:type="spellStart"/>
+      <w:r>
+        <w:t>classlib</w:t>
+      </w:r>
+      <w:proofErr w:type="spellEnd"/>
+      <w:r>
+        <w:t xml:space="preserve"> -n </w:t>
+      </w:r>
+      <w:proofErr w:type="spellStart"/>
+      <w:r>
+        <w:t>ABCPharmacy.Infrastructure</w:t>
+      </w:r>
+      <w:proofErr w:type="spellEnd"/>
+    </w:p>
+    <w:p>
+      <w:pPr>
+        <w:pStyle w:val="BodyText"/>
+        <w:ind w:left="580"/>
+      </w:pPr>
+    </w:p>
+    <w:p>
+      <w:pPr>
+        <w:pStyle w:val="BodyText"/>
+        <w:ind w:left="580"/>
+        <w:rPr>
+          <w:b/>
+          <w:bCs/>
+        </w:rPr>
+      </w:pPr>
+      <w:r>
+        <w:rPr>
+          <w:b/>
+          <w:bCs/>
+        </w:rPr>
+        <w:t>STEP 3: Add Projects to Solution</w:t>
+      </w:r>
+    </w:p>
+    <w:p>
+      <w:pPr>
+        <w:pStyle w:val="BodyText"/>
+        <w:ind w:left="580"/>
+        <w:rPr>
+          <w:b/>
+          <w:bCs/>
+        </w:rPr>
+      </w:pPr>
+      <w:r>
+        <w:rPr>
+          <w:b/>
+          <w:bCs/>
+        </w:rPr>
+        <w:t xml:space="preserve">dotnet </w:t>
+      </w:r>
+      <w:proofErr w:type="spellStart"/>
+      <w:r>
+        <w:rPr>
+          <w:b/>
+          <w:bCs/>
+        </w:rPr>
+        <w:t>sln</w:t>
+      </w:r>
+      <w:proofErr w:type="spellEnd"/>
+      <w:r>
+        <w:rPr>
+          <w:b/>
+          <w:bCs/>
+        </w:rPr>
+        <w:t xml:space="preserve"> add </w:t>
+      </w:r>
+      <w:proofErr w:type="spellStart"/>
+      <w:r>
+        <w:rPr>
+          <w:b/>
+          <w:bCs/>
+        </w:rPr>
+        <w:t>ABCPharmacy.API</w:t>
+      </w:r>
+      <w:proofErr w:type="spellEnd"/>
+      <w:r>
+        <w:rPr>
+          <w:b/>
+          <w:bCs/>
+        </w:rPr>
+        <w:t>/</w:t>
+      </w:r>
+      <w:proofErr w:type="spellStart"/>
+      <w:r>
+        <w:rPr>
+          <w:b/>
+          <w:bCs/>
+        </w:rPr>
+        <w:t>ABCPharmacy.API.csproj</w:t>
+      </w:r>
+      <w:proofErr w:type="spellEnd"/>
+      <w:r>
+        <w:rPr>
+          <w:b/>
+          <w:bCs/>
+        </w:rPr>
+        <w:br/>
+        <w:t xml:space="preserve">dotnet </w:t>
+      </w:r>
+      <w:proofErr w:type="spellStart"/>
+      <w:r>
+        <w:rPr>
+          <w:b/>
+          <w:bCs/>
+        </w:rPr>
+        <w:t>sln</w:t>
+      </w:r>
+      <w:proofErr w:type="spellEnd"/>
+      <w:r>
+        <w:rPr>
+          <w:b/>
+          <w:bCs/>
+        </w:rPr>
+        <w:t xml:space="preserve"> add </w:t>
+      </w:r>
+      <w:proofErr w:type="spellStart"/>
+      <w:r>
+        <w:rPr>
+          <w:b/>
+          <w:bCs/>
+        </w:rPr>
+        <w:t>ABCPharmacy.Application</w:t>
+      </w:r>
+      <w:proofErr w:type="spellEnd"/>
+      <w:r>
+        <w:rPr>
+          <w:b/>
+          <w:bCs/>
+        </w:rPr>
+        <w:t>/</w:t>
+      </w:r>
+      <w:proofErr w:type="spellStart"/>
+      <w:r>
+        <w:rPr>
+          <w:b/>
+          <w:bCs/>
+        </w:rPr>
+        <w:t>ABCPharmacy.Application.csproj</w:t>
+      </w:r>
+      <w:proofErr w:type="spellEnd"/>
+      <w:r>
+        <w:rPr>
+          <w:b/>
+          <w:bCs/>
+        </w:rPr>
+        <w:br/>
+        <w:t xml:space="preserve">dotnet </w:t>
+      </w:r>
+      <w:proofErr w:type="spellStart"/>
+      <w:r>
+        <w:rPr>
+          <w:b/>
+          <w:bCs/>
+        </w:rPr>
+        <w:t>sln</w:t>
+      </w:r>
+      <w:proofErr w:type="spellEnd"/>
+      <w:r>
+        <w:rPr>
+          <w:b/>
+          <w:bCs/>
+        </w:rPr>
+        <w:t xml:space="preserve"> add </w:t>
+      </w:r>
+      <w:proofErr w:type="spellStart"/>
+      <w:r>
+        <w:rPr>
+          <w:b/>
+          <w:bCs/>
+        </w:rPr>
+        <w:t>ABCPharmacy.Domain</w:t>
+      </w:r>
+      <w:proofErr w:type="spellEnd"/>
+      <w:r>
+        <w:rPr>
+          <w:b/>
+          <w:bCs/>
+        </w:rPr>
+        <w:t>/</w:t>
+      </w:r>
+      <w:proofErr w:type="spellStart"/>
+      <w:r>
+        <w:rPr>
+          <w:b/>
+          <w:bCs/>
+        </w:rPr>
+        <w:t>ABCPharmacy.Domain.csproj</w:t>
+      </w:r>
+      <w:proofErr w:type="spellEnd"/>
+      <w:r>
+        <w:rPr>
+          <w:b/>
+          <w:bCs/>
+        </w:rPr>
+        <w:br/>
+        <w:t xml:space="preserve">dotnet </w:t>
+      </w:r>
+      <w:proofErr w:type="spellStart"/>
+      <w:r>
+        <w:rPr>
+          <w:b/>
+          <w:bCs/>
+        </w:rPr>
+        <w:t>sln</w:t>
+      </w:r>
+      <w:proofErr w:type="spellEnd"/>
+      <w:r>
+        <w:rPr>
+          <w:b/>
+          <w:bCs/>
+        </w:rPr>
+        <w:t xml:space="preserve"> add </w:t>
+      </w:r>
+      <w:proofErr w:type="spellStart"/>
+      <w:r>
+        <w:rPr>
+          <w:b/>
+          <w:bCs/>
+        </w:rPr>
+        <w:t>ABCPharmacy.Infrastructure</w:t>
+      </w:r>
+      <w:proofErr w:type="spellEnd"/>
+      <w:r>
+        <w:rPr>
+          <w:b/>
+          <w:bCs/>
+        </w:rPr>
+        <w:t>/</w:t>
+      </w:r>
+      <w:proofErr w:type="spellStart"/>
+      <w:r>
+        <w:rPr>
+          <w:b/>
+          <w:bCs/>
+        </w:rPr>
+        <w:t>ABCPharmacy.Infrastructure.csproj</w:t>
+      </w:r>
+      <w:proofErr w:type="spellEnd"/>
     </w:p>
     <w:sectPr>
       <w:pgSz w:w="11910" w:h="16840"/>
-      <w:pgMar w:top="1480" w:bottom="280" w:left="1700" w:right="850"/>
+      <w:pgMar w:top="1480" w:right="850" w:bottom="280" w:left="1700" w:header="720" w:footer="720" w:gutter="0"/>
+      <w:cols w:space="720"/>
     </w:sectPr>
   </w:body>
 </w:document>
 </file>
 
 <file path=word/numbering.xml><?xml version="1.0" encoding="utf-8"?>
-<w:numbering xmlns:ve="http://schemas.openxmlformats.org/markup-compatibility/2006" xmlns:o="urn:schemas-microsoft-com:office:office" xmlns:r="http://schemas.openxmlformats.org/officeDocument/2006/relationships" xmlns:m="http://schemas.openxmlformats.org/officeDocument/2006/math" xmlns:v="urn:schemas-microsoft-com:vml" xmlns:wp="http://schemas.openxmlformats.org/drawingml/2006/wordprocessingDrawing" xmlns:w10="urn:schemas-microsoft-com:office:word" xmlns:w="http://schemas.openxmlformats.org/wordprocessingml/2006/main" xmlns:wne="http://schemas.microsoft.com/office/word/2006/wordml">
-  <w:abstractNum w:abstractNumId="0">
+<w:numbering xmlns:wpc="http://schemas.microsoft.com/office/word/2010/wordprocessingCanvas" xmlns:cx="http://schemas.microsoft.com/office/drawing/2014/chartex" xmlns:cx1="http://schemas.microsoft.com/office/drawing/2015/9/8/chartex" xmlns:cx2="http://schemas.microsoft.com/office/drawing/2015/10/21/chartex" xmlns:cx3="http://schemas.microsoft.com/office/drawing/2016/5/9/chartex" xmlns:cx4="http://schemas.microsoft.com/office/drawing/2016/5/10/chartex" xmlns:cx5="http://schemas.microsoft.com/office/drawing/2016/5/11/chartex" xmlns:cx6="http://schemas.microsoft.com/office/drawing/2016/5/12/chartex" xmlns:cx7="http://schemas.microsoft.com/office/drawing/2016/5/13/chartex" xmlns:cx8="http://schemas.microsoft.com/office/drawing/2016/5/14/chartex" xmlns:mc="http://schemas.openxmlformats.org/markup-compatibility/2006" xmlns:aink="http://schemas.microsoft.com/office/drawing/2016/ink" xmlns:am3d="http://schemas.microsoft.com/office/drawing/2017/model3d" xmlns:o="urn:schemas-microsoft-com:office:office" xmlns:oel="http://schemas.microsoft.com/office/2019/extlst" xmlns:r="http://schemas.openxmlformats.org/officeDocument/2006/relationships" xmlns:m="http://schemas.openxmlformats.org/officeDocument/2006/math" xmlns:v="urn:schemas-microsoft-com:vml" xmlns:wp14="http://schemas.microsoft.com/office/word/2010/wordprocessingDrawing" xmlns:wp="http://schemas.openxmlformats.org/drawingml/2006/wordprocessingDrawing" xmlns:w10="urn:schemas-microsoft-com:office:word" xmlns:w="http://schemas.openxmlformats.org/wordprocessingml/2006/main" xmlns:w14="http://schemas.microsoft.com/office/word/2010/wordml" xmlns:w15="http://schemas.microsoft.com/office/word/2012/wordml" xmlns:w16cex="http://schemas.microsoft.com/office/word/2018/wordml/cex" xmlns:w16cid="http://schemas.microsoft.com/office/word/2016/wordml/cid" xmlns:w16="http://schemas.microsoft.com/office/word/2018/wordml" xmlns:w16du="http://schemas.microsoft.com/office/word/2023/wordml/word16du" xmlns:w16sdtdh="http://schemas.microsoft.com/office/word/2020/wordml/sdtdatahash" xmlns:w16sdtfl="http://schemas.microsoft.com/office/word/2024/wordml/sdtformatlock" xmlns:w16se="http://schemas.microsoft.com/office/word/2015/wordml/symex" xmlns:wpg="http://schemas.microsoft.com/office/word/2010/wordprocessingGroup" xmlns:wpi="http://schemas.microsoft.com/office/word/2010/wordprocessingInk" xmlns:wne="http://schemas.microsoft.com/office/word/2006/wordml" xmlns:wps="http://schemas.microsoft.com/office/word/2010/wordprocessingShape" mc:Ignorable="w14 w15 w16se w16cid w16 w16cex w16sdtdh w16sdtfl w16du wp14">
+  <w:abstractNum w:abstractNumId="0" w15:restartNumberingAfterBreak="0">
+    <w:nsid w:val="682F2BB5"/>
     <w:multiLevelType w:val="hybridMultilevel"/>
-    <w:lvl w:ilvl="0">
-      <w:start w:val="0"/>
+    <w:tmpl w:val="D586054A"/>
+    <w:lvl w:ilvl="0" w:tplc="61D496BA">
       <w:numFmt w:val="bullet"/>
       <w:lvlText w:val="-"/>
       <w:lvlJc w:val="left"/>
@@ -2281,7 +3341,7 @@
         <w:ind w:left="772" w:hanging="193"/>
       </w:pPr>
       <w:rPr>
-        <w:rFonts w:hint="default" w:ascii="Courier New" w:hAnsi="Courier New" w:eastAsia="Courier New" w:cs="Courier New"/>
+        <w:rFonts w:ascii="Courier New" w:eastAsia="Courier New" w:hAnsi="Courier New" w:cs="Courier New" w:hint="default"/>
         <w:b w:val="0"/>
         <w:bCs w:val="0"/>
         <w:i w:val="0"/>
@@ -2293,8 +3353,7 @@
         <w:lang w:val="en-US" w:eastAsia="en-US" w:bidi="ar-SA"/>
       </w:rPr>
     </w:lvl>
-    <w:lvl w:ilvl="1">
-      <w:start w:val="0"/>
+    <w:lvl w:ilvl="1" w:tplc="DBE09B88">
       <w:numFmt w:val="bullet"/>
       <w:lvlText w:val="-"/>
       <w:lvlJc w:val="left"/>
@@ -2302,7 +3361,7 @@
         <w:ind w:left="964" w:hanging="193"/>
       </w:pPr>
       <w:rPr>
-        <w:rFonts w:hint="default" w:ascii="Courier New" w:hAnsi="Courier New" w:eastAsia="Courier New" w:cs="Courier New"/>
+        <w:rFonts w:ascii="Courier New" w:eastAsia="Courier New" w:hAnsi="Courier New" w:cs="Courier New" w:hint="default"/>
         <w:b w:val="0"/>
         <w:bCs w:val="0"/>
         <w:i w:val="0"/>
@@ -2314,8 +3373,7 @@
         <w:lang w:val="en-US" w:eastAsia="en-US" w:bidi="ar-SA"/>
       </w:rPr>
     </w:lvl>
-    <w:lvl w:ilvl="2">
-      <w:start w:val="0"/>
+    <w:lvl w:ilvl="2" w:tplc="22C8BD46">
       <w:numFmt w:val="bullet"/>
       <w:lvlText w:val="•"/>
       <w:lvlJc w:val="left"/>
@@ -2327,8 +3385,7 @@
         <w:lang w:val="en-US" w:eastAsia="en-US" w:bidi="ar-SA"/>
       </w:rPr>
     </w:lvl>
-    <w:lvl w:ilvl="3">
-      <w:start w:val="0"/>
+    <w:lvl w:ilvl="3" w:tplc="C63472F4">
       <w:numFmt w:val="bullet"/>
       <w:lvlText w:val="•"/>
       <w:lvlJc w:val="left"/>
@@ -2340,8 +3397,7 @@
         <w:lang w:val="en-US" w:eastAsia="en-US" w:bidi="ar-SA"/>
       </w:rPr>
     </w:lvl>
-    <w:lvl w:ilvl="4">
-      <w:start w:val="0"/>
+    <w:lvl w:ilvl="4" w:tplc="5D5C245E">
       <w:numFmt w:val="bullet"/>
       <w:lvlText w:val="•"/>
       <w:lvlJc w:val="left"/>
@@ -2353,8 +3409,7 @@
         <w:lang w:val="en-US" w:eastAsia="en-US" w:bidi="ar-SA"/>
       </w:rPr>
     </w:lvl>
-    <w:lvl w:ilvl="5">
-      <w:start w:val="0"/>
+    <w:lvl w:ilvl="5" w:tplc="A454CC6E">
       <w:numFmt w:val="bullet"/>
       <w:lvlText w:val="•"/>
       <w:lvlJc w:val="left"/>
@@ -2366,8 +3421,7 @@
         <w:lang w:val="en-US" w:eastAsia="en-US" w:bidi="ar-SA"/>
       </w:rPr>
     </w:lvl>
-    <w:lvl w:ilvl="6">
-      <w:start w:val="0"/>
+    <w:lvl w:ilvl="6" w:tplc="238C2798">
       <w:numFmt w:val="bullet"/>
       <w:lvlText w:val="•"/>
       <w:lvlJc w:val="left"/>
@@ -2379,8 +3433,7 @@
         <w:lang w:val="en-US" w:eastAsia="en-US" w:bidi="ar-SA"/>
       </w:rPr>
     </w:lvl>
-    <w:lvl w:ilvl="7">
-      <w:start w:val="0"/>
+    <w:lvl w:ilvl="7" w:tplc="4274B250">
       <w:numFmt w:val="bullet"/>
       <w:lvlText w:val="•"/>
       <w:lvlJc w:val="left"/>
@@ -2392,8 +3445,7 @@
         <w:lang w:val="en-US" w:eastAsia="en-US" w:bidi="ar-SA"/>
       </w:rPr>
     </w:lvl>
-    <w:lvl w:ilvl="8">
-      <w:start w:val="0"/>
+    <w:lvl w:ilvl="8" w:tplc="383A7710">
       <w:numFmt w:val="bullet"/>
       <w:lvlText w:val="•"/>
       <w:lvlJc w:val="left"/>
@@ -2406,21 +3458,21 @@
       </w:rPr>
     </w:lvl>
   </w:abstractNum>
-  <w:num w:numId="1">
+  <w:num w:numId="1" w16cid:durableId="1129011013">
     <w:abstractNumId w:val="0"/>
   </w:num>
 </w:numbering>
 </file>
 
 <file path=word/styles.xml><?xml version="1.0" encoding="utf-8"?>
-<w:styles xmlns:r="http://schemas.openxmlformats.org/officeDocument/2006/relationships" xmlns:w="http://schemas.openxmlformats.org/wordprocessingml/2006/main">
+<w:styles xmlns:mc="http://schemas.openxmlformats.org/markup-compatibility/2006" xmlns:r="http://schemas.openxmlformats.org/officeDocument/2006/relationships" xmlns:w="http://schemas.openxmlformats.org/wordprocessingml/2006/main" xmlns:w14="http://schemas.microsoft.com/office/word/2010/wordml" xmlns:w15="http://schemas.microsoft.com/office/word/2012/wordml" xmlns:w16cex="http://schemas.microsoft.com/office/word/2018/wordml/cex" xmlns:w16cid="http://schemas.microsoft.com/office/word/2016/wordml/cid" xmlns:w16="http://schemas.microsoft.com/office/word/2018/wordml" xmlns:w16du="http://schemas.microsoft.com/office/word/2023/wordml/word16du" xmlns:w16sdtdh="http://schemas.microsoft.com/office/word/2020/wordml/sdtdatahash" xmlns:w16sdtfl="http://schemas.microsoft.com/office/word/2024/wordml/sdtformatlock" xmlns:w16se="http://schemas.microsoft.com/office/word/2015/wordml/symex" mc:Ignorable="w14 w15 w16se w16cid w16 w16cex w16sdtdh w16sdtfl w16du">
   <w:docDefaults>
     <w:rPrDefault>
       <w:rPr>
-        <w:rFonts w:cstheme="minorBidi" w:hAnsiTheme="minorHAnsi" w:eastAsiaTheme="minorHAnsi" w:asciiTheme="minorHAnsi"/>
+        <w:rFonts w:asciiTheme="minorHAnsi" w:eastAsiaTheme="minorHAnsi" w:hAnsiTheme="minorHAnsi" w:cstheme="minorBidi"/>
         <w:sz w:val="22"/>
         <w:szCs w:val="22"/>
-        <w:lang w:val="en-US" w:bidi="ar-SA" w:eastAsia="en-US"/>
+        <w:lang w:val="en-US" w:eastAsia="en-US" w:bidi="ar-SA"/>
       </w:rPr>
     </w:rPrDefault>
     <w:pPrDefault>
@@ -2428,51 +3480,437 @@
         <w:widowControl w:val="0"/>
         <w:autoSpaceDE w:val="0"/>
         <w:autoSpaceDN w:val="0"/>
-        <w:spacing w:lineRule="auto" w:line="240" w:before="0" w:after="0"/>
-        <w:ind w:left="0" w:right="0"/>
-        <w:jc w:val="left"/>
       </w:pPr>
     </w:pPrDefault>
   </w:docDefaults>
-  <w:style w:styleId="DefaultParagraphFont" w:default="1" w:type="character">
+  <w:latentStyles w:defLockedState="0" w:defUIPriority="99" w:defSemiHidden="0" w:defUnhideWhenUsed="0" w:defQFormat="0" w:count="376">
+    <w:lsdException w:name="Normal" w:uiPriority="0" w:qFormat="1"/>
+    <w:lsdException w:name="heading 1" w:uiPriority="9" w:qFormat="1"/>
+    <w:lsdException w:name="heading 2" w:semiHidden="1" w:uiPriority="9" w:unhideWhenUsed="1" w:qFormat="1"/>
+    <w:lsdException w:name="heading 3" w:semiHidden="1" w:uiPriority="9" w:unhideWhenUsed="1" w:qFormat="1"/>
+    <w:lsdException w:name="heading 4" w:semiHidden="1" w:uiPriority="9" w:unhideWhenUsed="1" w:qFormat="1"/>
+    <w:lsdException w:name="heading 5" w:semiHidden="1" w:uiPriority="9" w:unhideWhenUsed="1" w:qFormat="1"/>
+    <w:lsdException w:name="heading 6" w:semiHidden="1" w:uiPriority="9" w:unhideWhenUsed="1" w:qFormat="1"/>
+    <w:lsdException w:name="heading 7" w:semiHidden="1" w:uiPriority="9" w:unhideWhenUsed="1" w:qFormat="1"/>
+    <w:lsdException w:name="heading 8" w:semiHidden="1" w:uiPriority="9" w:unhideWhenUsed="1" w:qFormat="1"/>
+    <w:lsdException w:name="heading 9" w:semiHidden="1" w:uiPriority="9" w:unhideWhenUsed="1" w:qFormat="1"/>
+    <w:lsdException w:name="index 1" w:semiHidden="1" w:unhideWhenUsed="1"/>
+    <w:lsdException w:name="index 2" w:semiHidden="1" w:unhideWhenUsed="1"/>
+    <w:lsdException w:name="index 3" w:semiHidden="1" w:unhideWhenUsed="1"/>
+    <w:lsdException w:name="index 4" w:semiHidden="1" w:unhideWhenUsed="1"/>
+    <w:lsdException w:name="index 5" w:semiHidden="1" w:unhideWhenUsed="1"/>
+    <w:lsdException w:name="index 6" w:semiHidden="1" w:unhideWhenUsed="1"/>
+    <w:lsdException w:name="index 7" w:semiHidden="1" w:unhideWhenUsed="1"/>
+    <w:lsdException w:name="index 8" w:semiHidden="1" w:unhideWhenUsed="1"/>
+    <w:lsdException w:name="index 9" w:semiHidden="1" w:unhideWhenUsed="1"/>
+    <w:lsdException w:name="toc 1" w:semiHidden="1" w:uiPriority="39" w:unhideWhenUsed="1"/>
+    <w:lsdException w:name="toc 2" w:semiHidden="1" w:uiPriority="39" w:unhideWhenUsed="1"/>
+    <w:lsdException w:name="toc 3" w:semiHidden="1" w:uiPriority="39" w:unhideWhenUsed="1"/>
+    <w:lsdException w:name="toc 4" w:semiHidden="1" w:uiPriority="39" w:unhideWhenUsed="1"/>
+    <w:lsdException w:name="toc 5" w:semiHidden="1" w:uiPriority="39" w:unhideWhenUsed="1"/>
+    <w:lsdException w:name="toc 6" w:semiHidden="1" w:uiPriority="39" w:unhideWhenUsed="1"/>
+    <w:lsdException w:name="toc 7" w:semiHidden="1" w:uiPriority="39" w:unhideWhenUsed="1"/>
+    <w:lsdException w:name="toc 8" w:semiHidden="1" w:uiPriority="39" w:unhideWhenUsed="1"/>
+    <w:lsdException w:name="toc 9" w:semiHidden="1" w:uiPriority="39" w:unhideWhenUsed="1"/>
+    <w:lsdException w:name="Normal Indent" w:semiHidden="1" w:unhideWhenUsed="1"/>
+    <w:lsdException w:name="footnote text" w:semiHidden="1" w:unhideWhenUsed="1"/>
+    <w:lsdException w:name="annotation text" w:semiHidden="1" w:unhideWhenUsed="1"/>
+    <w:lsdException w:name="header" w:semiHidden="1" w:unhideWhenUsed="1"/>
+    <w:lsdException w:name="footer" w:semiHidden="1" w:unhideWhenUsed="1"/>
+    <w:lsdException w:name="index heading" w:semiHidden="1" w:unhideWhenUsed="1"/>
+    <w:lsdException w:name="caption" w:semiHidden="1" w:uiPriority="35" w:unhideWhenUsed="1" w:qFormat="1"/>
+    <w:lsdException w:name="table of figures" w:semiHidden="1" w:unhideWhenUsed="1"/>
+    <w:lsdException w:name="envelope address" w:semiHidden="1" w:unhideWhenUsed="1"/>
+    <w:lsdException w:name="envelope return" w:semiHidden="1" w:unhideWhenUsed="1"/>
+    <w:lsdException w:name="footnote reference" w:semiHidden="1" w:unhideWhenUsed="1"/>
+    <w:lsdException w:name="annotation reference" w:semiHidden="1" w:unhideWhenUsed="1"/>
+    <w:lsdException w:name="line number" w:semiHidden="1" w:unhideWhenUsed="1"/>
+    <w:lsdException w:name="page number" w:semiHidden="1" w:unhideWhenUsed="1"/>
+    <w:lsdException w:name="endnote reference" w:semiHidden="1" w:unhideWhenUsed="1"/>
+    <w:lsdException w:name="endnote text" w:semiHidden="1" w:unhideWhenUsed="1"/>
+    <w:lsdException w:name="table of authorities" w:semiHidden="1" w:unhideWhenUsed="1"/>
+    <w:lsdException w:name="macro" w:semiHidden="1" w:unhideWhenUsed="1"/>
+    <w:lsdException w:name="toa heading" w:semiHidden="1" w:unhideWhenUsed="1"/>
+    <w:lsdException w:name="List" w:semiHidden="1" w:unhideWhenUsed="1"/>
+    <w:lsdException w:name="List Bullet" w:semiHidden="1" w:unhideWhenUsed="1"/>
+    <w:lsdException w:name="List Number" w:semiHidden="1" w:unhideWhenUsed="1"/>
+    <w:lsdException w:name="List 2" w:semiHidden="1" w:unhideWhenUsed="1"/>
+    <w:lsdException w:name="List 3" w:semiHidden="1" w:unhideWhenUsed="1"/>
+    <w:lsdException w:name="List 4" w:semiHidden="1" w:unhideWhenUsed="1"/>
+    <w:lsdException w:name="List 5" w:semiHidden="1" w:unhideWhenUsed="1"/>
+    <w:lsdException w:name="List Bullet 2" w:semiHidden="1" w:unhideWhenUsed="1"/>
+    <w:lsdException w:name="List Bullet 3" w:semiHidden="1" w:unhideWhenUsed="1"/>
+    <w:lsdException w:name="List Bullet 4" w:semiHidden="1" w:unhideWhenUsed="1"/>
+    <w:lsdException w:name="List Bullet 5" w:semiHidden="1" w:unhideWhenUsed="1"/>
+    <w:lsdException w:name="List Number 2" w:semiHidden="1" w:unhideWhenUsed="1"/>
+    <w:lsdException w:name="List Number 3" w:semiHidden="1" w:unhideWhenUsed="1"/>
+    <w:lsdException w:name="List Number 4" w:semiHidden="1" w:unhideWhenUsed="1"/>
+    <w:lsdException w:name="List Number 5" w:semiHidden="1" w:unhideWhenUsed="1"/>
+    <w:lsdException w:name="Title" w:uiPriority="10" w:qFormat="1"/>
+    <w:lsdException w:name="Closing" w:semiHidden="1" w:unhideWhenUsed="1"/>
+    <w:lsdException w:name="Signature" w:semiHidden="1" w:unhideWhenUsed="1"/>
+    <w:lsdException w:name="Default Paragraph Font" w:semiHidden="1" w:uiPriority="1" w:unhideWhenUsed="1"/>
+    <w:lsdException w:name="Body Text" w:semiHidden="1" w:unhideWhenUsed="1"/>
+    <w:lsdException w:name="Body Text Indent" w:semiHidden="1" w:unhideWhenUsed="1"/>
+    <w:lsdException w:name="List Continue" w:semiHidden="1" w:unhideWhenUsed="1"/>
+    <w:lsdException w:name="List Continue 2" w:semiHidden="1" w:unhideWhenUsed="1"/>
+    <w:lsdException w:name="List Continue 3" w:semiHidden="1" w:unhideWhenUsed="1"/>
+    <w:lsdException w:name="List Continue 4" w:semiHidden="1" w:unhideWhenUsed="1"/>
+    <w:lsdException w:name="List Continue 5" w:semiHidden="1" w:unhideWhenUsed="1"/>
+    <w:lsdException w:name="Message Header" w:semiHidden="1" w:unhideWhenUsed="1"/>
+    <w:lsdException w:name="Subtitle" w:uiPriority="11" w:qFormat="1"/>
+    <w:lsdException w:name="Salutation" w:semiHidden="1" w:unhideWhenUsed="1"/>
+    <w:lsdException w:name="Date" w:semiHidden="1" w:unhideWhenUsed="1"/>
+    <w:lsdException w:name="Body Text First Indent" w:semiHidden="1" w:unhideWhenUsed="1"/>
+    <w:lsdException w:name="Body Text First Indent 2" w:semiHidden="1" w:unhideWhenUsed="1"/>
+    <w:lsdException w:name="Note Heading" w:semiHidden="1" w:unhideWhenUsed="1"/>
+    <w:lsdException w:name="Body Text 2" w:semiHidden="1" w:unhideWhenUsed="1"/>
+    <w:lsdException w:name="Body Text 3" w:semiHidden="1" w:unhideWhenUsed="1"/>
+    <w:lsdException w:name="Body Text Indent 2" w:semiHidden="1" w:unhideWhenUsed="1"/>
+    <w:lsdException w:name="Body Text Indent 3" w:semiHidden="1" w:unhideWhenUsed="1"/>
+    <w:lsdException w:name="Block Text" w:semiHidden="1" w:unhideWhenUsed="1"/>
+    <w:lsdException w:name="Hyperlink" w:semiHidden="1" w:unhideWhenUsed="1"/>
+    <w:lsdException w:name="FollowedHyperlink" w:semiHidden="1" w:unhideWhenUsed="1"/>
+    <w:lsdException w:name="Strong" w:uiPriority="22" w:qFormat="1"/>
+    <w:lsdException w:name="Emphasis" w:uiPriority="20" w:qFormat="1"/>
+    <w:lsdException w:name="Document Map" w:semiHidden="1" w:unhideWhenUsed="1"/>
+    <w:lsdException w:name="Plain Text" w:semiHidden="1" w:unhideWhenUsed="1"/>
+    <w:lsdException w:name="E-mail Signature" w:semiHidden="1" w:unhideWhenUsed="1"/>
+    <w:lsdException w:name="HTML Top of Form" w:semiHidden="1" w:unhideWhenUsed="1"/>
+    <w:lsdException w:name="HTML Bottom of Form" w:semiHidden="1" w:unhideWhenUsed="1"/>
+    <w:lsdException w:name="Normal (Web)" w:semiHidden="1" w:unhideWhenUsed="1"/>
+    <w:lsdException w:name="HTML Acronym" w:semiHidden="1" w:unhideWhenUsed="1"/>
+    <w:lsdException w:name="HTML Address" w:semiHidden="1" w:unhideWhenUsed="1"/>
+    <w:lsdException w:name="HTML Cite" w:semiHidden="1" w:unhideWhenUsed="1"/>
+    <w:lsdException w:name="HTML Code" w:semiHidden="1" w:unhideWhenUsed="1"/>
+    <w:lsdException w:name="HTML Definition" w:semiHidden="1" w:unhideWhenUsed="1"/>
+    <w:lsdException w:name="HTML Keyboard" w:semiHidden="1" w:unhideWhenUsed="1"/>
+    <w:lsdException w:name="HTML Preformatted" w:semiHidden="1" w:unhideWhenUsed="1"/>
+    <w:lsdException w:name="HTML Sample" w:semiHidden="1" w:unhideWhenUsed="1"/>
+    <w:lsdException w:name="HTML Typewriter" w:semiHidden="1" w:unhideWhenUsed="1"/>
+    <w:lsdException w:name="HTML Variable" w:semiHidden="1" w:unhideWhenUsed="1"/>
+    <w:lsdException w:name="Normal Table" w:semiHidden="1" w:unhideWhenUsed="1"/>
+    <w:lsdException w:name="annotation subject" w:semiHidden="1" w:unhideWhenUsed="1"/>
+    <w:lsdException w:name="No List" w:semiHidden="1" w:unhideWhenUsed="1"/>
+    <w:lsdException w:name="Outline List 1" w:semiHidden="1" w:unhideWhenUsed="1"/>
+    <w:lsdException w:name="Outline List 2" w:semiHidden="1" w:unhideWhenUsed="1"/>
+    <w:lsdException w:name="Outline List 3" w:semiHidden="1" w:unhideWhenUsed="1"/>
+    <w:lsdException w:name="Table Simple 1" w:semiHidden="1" w:unhideWhenUsed="1"/>
+    <w:lsdException w:name="Table Simple 2" w:semiHidden="1" w:unhideWhenUsed="1"/>
+    <w:lsdException w:name="Table Simple 3" w:semiHidden="1" w:unhideWhenUsed="1"/>
+    <w:lsdException w:name="Table Classic 1" w:semiHidden="1" w:unhideWhenUsed="1"/>
+    <w:lsdException w:name="Table Classic 2" w:semiHidden="1" w:unhideWhenUsed="1"/>
+    <w:lsdException w:name="Table Classic 3" w:semiHidden="1" w:unhideWhenUsed="1"/>
+    <w:lsdException w:name="Table Classic 4" w:semiHidden="1" w:unhideWhenUsed="1"/>
+    <w:lsdException w:name="Table Colorful 1" w:semiHidden="1" w:unhideWhenUsed="1"/>
+    <w:lsdException w:name="Table Colorful 2" w:semiHidden="1" w:unhideWhenUsed="1"/>
+    <w:lsdException w:name="Table Colorful 3" w:semiHidden="1" w:unhideWhenUsed="1"/>
+    <w:lsdException w:name="Table Columns 1" w:semiHidden="1" w:unhideWhenUsed="1"/>
+    <w:lsdException w:name="Table Columns 2" w:semiHidden="1" w:unhideWhenUsed="1"/>
+    <w:lsdException w:name="Table Columns 3" w:semiHidden="1" w:unhideWhenUsed="1"/>
+    <w:lsdException w:name="Table Columns 4" w:semiHidden="1" w:unhideWhenUsed="1"/>
+    <w:lsdException w:name="Table Columns 5" w:semiHidden="1" w:unhideWhenUsed="1"/>
+    <w:lsdException w:name="Table Grid 1" w:semiHidden="1" w:unhideWhenUsed="1"/>
+    <w:lsdException w:name="Table Grid 2" w:semiHidden="1" w:unhideWhenUsed="1"/>
+    <w:lsdException w:name="Table Grid 3" w:semiHidden="1" w:unhideWhenUsed="1"/>
+    <w:lsdException w:name="Table Grid 4" w:semiHidden="1" w:unhideWhenUsed="1"/>
+    <w:lsdException w:name="Table Grid 5" w:semiHidden="1" w:unhideWhenUsed="1"/>
+    <w:lsdException w:name="Table Grid 6" w:semiHidden="1" w:unhideWhenUsed="1"/>
+    <w:lsdException w:name="Table Grid 7" w:semiHidden="1" w:unhideWhenUsed="1"/>
+    <w:lsdException w:name="Table Grid 8" w:semiHidden="1" w:unhideWhenUsed="1"/>
+    <w:lsdException w:name="Table List 1" w:semiHidden="1" w:unhideWhenUsed="1"/>
+    <w:lsdException w:name="Table List 2" w:semiHidden="1" w:unhideWhenUsed="1"/>
+    <w:lsdException w:name="Table List 3" w:semiHidden="1" w:unhideWhenUsed="1"/>
+    <w:lsdException w:name="Table List 4" w:semiHidden="1" w:unhideWhenUsed="1"/>
+    <w:lsdException w:name="Table List 5" w:semiHidden="1" w:unhideWhenUsed="1"/>
+    <w:lsdException w:name="Table List 6" w:semiHidden="1" w:unhideWhenUsed="1"/>
+    <w:lsdException w:name="Table List 7" w:semiHidden="1" w:unhideWhenUsed="1"/>
+    <w:lsdException w:name="Table List 8" w:semiHidden="1" w:unhideWhenUsed="1"/>
+    <w:lsdException w:name="Table 3D effects 1" w:semiHidden="1" w:unhideWhenUsed="1"/>
+    <w:lsdException w:name="Table 3D effects 2" w:semiHidden="1" w:unhideWhenUsed="1"/>
+    <w:lsdException w:name="Table 3D effects 3" w:semiHidden="1" w:unhideWhenUsed="1"/>
+    <w:lsdException w:name="Table Contemporary" w:semiHidden="1" w:unhideWhenUsed="1"/>
+    <w:lsdException w:name="Table Elegant" w:semiHidden="1" w:unhideWhenUsed="1"/>
+    <w:lsdException w:name="Table Professional" w:semiHidden="1" w:unhideWhenUsed="1"/>
+    <w:lsdException w:name="Table Subtle 1" w:semiHidden="1" w:unhideWhenUsed="1"/>
+    <w:lsdException w:name="Table Subtle 2" w:semiHidden="1" w:unhideWhenUsed="1"/>
+    <w:lsdException w:name="Table Web 1" w:semiHidden="1" w:unhideWhenUsed="1"/>
+    <w:lsdException w:name="Table Web 2" w:semiHidden="1" w:unhideWhenUsed="1"/>
+    <w:lsdException w:name="Table Web 3" w:semiHidden="1" w:unhideWhenUsed="1"/>
+    <w:lsdException w:name="Balloon Text" w:semiHidden="1" w:unhideWhenUsed="1"/>
+    <w:lsdException w:name="Table Grid" w:uiPriority="39"/>
+    <w:lsdException w:name="Table Theme" w:semiHidden="1" w:unhideWhenUsed="1"/>
+    <w:lsdException w:name="Placeholder Text" w:semiHidden="1"/>
+    <w:lsdException w:name="No Spacing" w:uiPriority="1" w:qFormat="1"/>
+    <w:lsdException w:name="Light Shading" w:uiPriority="60"/>
+    <w:lsdException w:name="Light List" w:uiPriority="61"/>
+    <w:lsdException w:name="Light Grid" w:uiPriority="62"/>
+    <w:lsdException w:name="Medium Shading 1" w:uiPriority="63"/>
+    <w:lsdException w:name="Medium Shading 2" w:uiPriority="64"/>
+    <w:lsdException w:name="Medium List 1" w:uiPriority="65"/>
+    <w:lsdException w:name="Medium List 2" w:uiPriority="66"/>
+    <w:lsdException w:name="Medium Grid 1" w:uiPriority="67"/>
+    <w:lsdException w:name="Medium Grid 2" w:uiPriority="68"/>
+    <w:lsdException w:name="Medium Grid 3" w:uiPriority="69"/>
+    <w:lsdException w:name="Dark List" w:uiPriority="70"/>
+    <w:lsdException w:name="Colorful Shading" w:uiPriority="71"/>
+    <w:lsdException w:name="Colorful List" w:uiPriority="72"/>
+    <w:lsdException w:name="Colorful Grid" w:uiPriority="73"/>
+    <w:lsdException w:name="Light Shading Accent 1" w:uiPriority="60"/>
+    <w:lsdException w:name="Light List Accent 1" w:uiPriority="61"/>
+    <w:lsdException w:name="Light Grid Accent 1" w:uiPriority="62"/>
+    <w:lsdException w:name="Medium Shading 1 Accent 1" w:uiPriority="63"/>
+    <w:lsdException w:name="Medium Shading 2 Accent 1" w:uiPriority="64"/>
+    <w:lsdException w:name="Medium List 1 Accent 1" w:uiPriority="65"/>
+    <w:lsdException w:name="Revision" w:semiHidden="1"/>
+    <w:lsdException w:name="List Paragraph" w:uiPriority="34" w:qFormat="1"/>
+    <w:lsdException w:name="Quote" w:uiPriority="29" w:qFormat="1"/>
+    <w:lsdException w:name="Intense Quote" w:uiPriority="30" w:qFormat="1"/>
+    <w:lsdException w:name="Medium List 2 Accent 1" w:uiPriority="66"/>
+    <w:lsdException w:name="Medium Grid 1 Accent 1" w:uiPriority="67"/>
+    <w:lsdException w:name="Medium Grid 2 Accent 1" w:uiPriority="68"/>
+    <w:lsdException w:name="Medium Grid 3 Accent 1" w:uiPriority="69"/>
+    <w:lsdException w:name="Dark List Accent 1" w:uiPriority="70"/>
+    <w:lsdException w:name="Colorful Shading Accent 1" w:uiPriority="71"/>
+    <w:lsdException w:name="Colorful List Accent 1" w:uiPriority="72"/>
+    <w:lsdException w:name="Colorful Grid Accent 1" w:uiPriority="73"/>
+    <w:lsdException w:name="Light Shading Accent 2" w:uiPriority="60"/>
+    <w:lsdException w:name="Light List Accent 2" w:uiPriority="61"/>
+    <w:lsdException w:name="Light Grid Accent 2" w:uiPriority="62"/>
+    <w:lsdException w:name="Medium Shading 1 Accent 2" w:uiPriority="63"/>
+    <w:lsdException w:name="Medium Shading 2 Accent 2" w:uiPriority="64"/>
+    <w:lsdException w:name="Medium List 1 Accent 2" w:uiPriority="65"/>
+    <w:lsdException w:name="Medium List 2 Accent 2" w:uiPriority="66"/>
+    <w:lsdException w:name="Medium Grid 1 Accent 2" w:uiPriority="67"/>
+    <w:lsdException w:name="Medium Grid 2 Accent 2" w:uiPriority="68"/>
+    <w:lsdException w:name="Medium Grid 3 Accent 2" w:uiPriority="69"/>
+    <w:lsdException w:name="Dark List Accent 2" w:uiPriority="70"/>
+    <w:lsdException w:name="Colorful Shading Accent 2" w:uiPriority="71"/>
+    <w:lsdException w:name="Colorful List Accent 2" w:uiPriority="72"/>
+    <w:lsdException w:name="Colorful Grid Accent 2" w:uiPriority="73"/>
+    <w:lsdException w:name="Light Shading Accent 3" w:uiPriority="60"/>
+    <w:lsdException w:name="Light List Accent 3" w:uiPriority="61"/>
+    <w:lsdException w:name="Light Grid Accent 3" w:uiPriority="62"/>
+    <w:lsdException w:name="Medium Shading 1 Accent 3" w:uiPriority="63"/>
+    <w:lsdException w:name="Medium Shading 2 Accent 3" w:uiPriority="64"/>
+    <w:lsdException w:name="Medium List 1 Accent 3" w:uiPriority="65"/>
+    <w:lsdException w:name="Medium List 2 Accent 3" w:uiPriority="66"/>
+    <w:lsdException w:name="Medium Grid 1 Accent 3" w:uiPriority="67"/>
+    <w:lsdException w:name="Medium Grid 2 Accent 3" w:uiPriority="68"/>
+    <w:lsdException w:name="Medium Grid 3 Accent 3" w:uiPriority="69"/>
+    <w:lsdException w:name="Dark List Accent 3" w:uiPriority="70"/>
+    <w:lsdException w:name="Colorful Shading Accent 3" w:uiPriority="71"/>
+    <w:lsdException w:name="Colorful List Accent 3" w:uiPriority="72"/>
+    <w:lsdException w:name="Colorful Grid Accent 3" w:uiPriority="73"/>
+    <w:lsdException w:name="Light Shading Accent 4" w:uiPriority="60"/>
+    <w:lsdException w:name="Light List Accent 4" w:uiPriority="61"/>
+    <w:lsdException w:name="Light Grid Accent 4" w:uiPriority="62"/>
+    <w:lsdException w:name="Medium Shading 1 Accent 4" w:uiPriority="63"/>
+    <w:lsdException w:name="Medium Shading 2 Accent 4" w:uiPriority="64"/>
+    <w:lsdException w:name="Medium List 1 Accent 4" w:uiPriority="65"/>
+    <w:lsdException w:name="Medium List 2 Accent 4" w:uiPriority="66"/>
+    <w:lsdException w:name="Medium Grid 1 Accent 4" w:uiPriority="67"/>
+    <w:lsdException w:name="Medium Grid 2 Accent 4" w:uiPriority="68"/>
+    <w:lsdException w:name="Medium Grid 3 Accent 4" w:uiPriority="69"/>
+    <w:lsdException w:name="Dark List Accent 4" w:uiPriority="70"/>
+    <w:lsdException w:name="Colorful Shading Accent 4" w:uiPriority="71"/>
+    <w:lsdException w:name="Colorful List Accent 4" w:uiPriority="72"/>
+    <w:lsdException w:name="Colorful Grid Accent 4" w:uiPriority="73"/>
+    <w:lsdException w:name="Light Shading Accent 5" w:uiPriority="60"/>
+    <w:lsdException w:name="Light List Accent 5" w:uiPriority="61"/>
+    <w:lsdException w:name="Light Grid Accent 5" w:uiPriority="62"/>
+    <w:lsdException w:name="Medium Shading 1 Accent 5" w:uiPriority="63"/>
+    <w:lsdException w:name="Medium Shading 2 Accent 5" w:uiPriority="64"/>
+    <w:lsdException w:name="Medium List 1 Accent 5" w:uiPriority="65"/>
+    <w:lsdException w:name="Medium List 2 Accent 5" w:uiPriority="66"/>
+    <w:lsdException w:name="Medium Grid 1 Accent 5" w:uiPriority="67"/>
+    <w:lsdException w:name="Medium Grid 2 Accent 5" w:uiPriority="68"/>
+    <w:lsdException w:name="Medium Grid 3 Accent 5" w:uiPriority="69"/>
+    <w:lsdException w:name="Dark List Accent 5" w:uiPriority="70"/>
+    <w:lsdException w:name="Colorful Shading Accent 5" w:uiPriority="71"/>
+    <w:lsdException w:name="Colorful List Accent 5" w:uiPriority="72"/>
+    <w:lsdException w:name="Colorful Grid Accent 5" w:uiPriority="73"/>
+    <w:lsdException w:name="Light Shading Accent 6" w:uiPriority="60"/>
+    <w:lsdException w:name="Light List Accent 6" w:uiPriority="61"/>
+    <w:lsdException w:name="Light Grid Accent 6" w:uiPriority="62"/>
+    <w:lsdException w:name="Medium Shading 1 Accent 6" w:uiPriority="63"/>
+    <w:lsdException w:name="Medium Shading 2 Accent 6" w:uiPriority="64"/>
+    <w:lsdException w:name="Medium List 1 Accent 6" w:uiPriority="65"/>
+    <w:lsdException w:name="Medium List 2 Accent 6" w:uiPriority="66"/>
+    <w:lsdException w:name="Medium Grid 1 Accent 6" w:uiPriority="67"/>
+    <w:lsdException w:name="Medium Grid 2 Accent 6" w:uiPriority="68"/>
+    <w:lsdException w:name="Medium Grid 3 Accent 6" w:uiPriority="69"/>
+    <w:lsdException w:name="Dark List Accent 6" w:uiPriority="70"/>
+    <w:lsdException w:name="Colorful Shading Accent 6" w:uiPriority="71"/>
+    <w:lsdException w:name="Colorful List Accent 6" w:uiPriority="72"/>
+    <w:lsdException w:name="Colorful Grid Accent 6" w:uiPriority="73"/>
+    <w:lsdException w:name="Subtle Emphasis" w:uiPriority="19" w:qFormat="1"/>
+    <w:lsdException w:name="Intense Emphasis" w:uiPriority="21" w:qFormat="1"/>
+    <w:lsdException w:name="Subtle Reference" w:uiPriority="31" w:qFormat="1"/>
+    <w:lsdException w:name="Intense Reference" w:uiPriority="32" w:qFormat="1"/>
+    <w:lsdException w:name="Book Title" w:uiPriority="33" w:qFormat="1"/>
+    <w:lsdException w:name="Bibliography" w:semiHidden="1" w:uiPriority="37" w:unhideWhenUsed="1"/>
+    <w:lsdException w:name="TOC Heading" w:semiHidden="1" w:uiPriority="39" w:unhideWhenUsed="1" w:qFormat="1"/>
+    <w:lsdException w:name="Plain Table 1" w:uiPriority="41"/>
+    <w:lsdException w:name="Plain Table 2" w:uiPriority="42"/>
+    <w:lsdException w:name="Plain Table 3" w:uiPriority="43"/>
+    <w:lsdException w:name="Plain Table 4" w:uiPriority="44"/>
+    <w:lsdException w:name="Plain Table 5" w:uiPriority="45"/>
+    <w:lsdException w:name="Grid Table Light" w:uiPriority="40"/>
+    <w:lsdException w:name="Grid Table 1 Light" w:uiPriority="46"/>
+    <w:lsdException w:name="Grid Table 2" w:uiPriority="47"/>
+    <w:lsdException w:name="Grid Table 3" w:uiPriority="48"/>
+    <w:lsdException w:name="Grid Table 4" w:uiPriority="49"/>
+    <w:lsdException w:name="Grid Table 5 Dark" w:uiPriority="50"/>
+    <w:lsdException w:name="Grid Table 6 Colorful" w:uiPriority="51"/>
+    <w:lsdException w:name="Grid Table 7 Colorful" w:uiPriority="52"/>
+    <w:lsdException w:name="Grid Table 1 Light Accent 1" w:uiPriority="46"/>
+    <w:lsdException w:name="Grid Table 2 Accent 1" w:uiPriority="47"/>
+    <w:lsdException w:name="Grid Table 3 Accent 1" w:uiPriority="48"/>
+    <w:lsdException w:name="Grid Table 4 Accent 1" w:uiPriority="49"/>
+    <w:lsdException w:name="Grid Table 5 Dark Accent 1" w:uiPriority="50"/>
+    <w:lsdException w:name="Grid Table 6 Colorful Accent 1" w:uiPriority="51"/>
+    <w:lsdException w:name="Grid Table 7 Colorful Accent 1" w:uiPriority="52"/>
+    <w:lsdException w:name="Grid Table 1 Light Accent 2" w:uiPriority="46"/>
+    <w:lsdException w:name="Grid Table 2 Accent 2" w:uiPriority="47"/>
+    <w:lsdException w:name="Grid Table 3 Accent 2" w:uiPriority="48"/>
+    <w:lsdException w:name="Grid Table 4 Accent 2" w:uiPriority="49"/>
+    <w:lsdException w:name="Grid Table 5 Dark Accent 2" w:uiPriority="50"/>
+    <w:lsdException w:name="Grid Table 6 Colorful Accent 2" w:uiPriority="51"/>
+    <w:lsdException w:name="Grid Table 7 Colorful Accent 2" w:uiPriority="52"/>
+    <w:lsdException w:name="Grid Table 1 Light Accent 3" w:uiPriority="46"/>
+    <w:lsdException w:name="Grid Table 2 Accent 3" w:uiPriority="47"/>
+    <w:lsdException w:name="Grid Table 3 Accent 3" w:uiPriority="48"/>
+    <w:lsdException w:name="Grid Table 4 Accent 3" w:uiPriority="49"/>
+    <w:lsdException w:name="Grid Table 5 Dark Accent 3" w:uiPriority="50"/>
+    <w:lsdException w:name="Grid Table 6 Colorful Accent 3" w:uiPriority="51"/>
+    <w:lsdException w:name="Grid Table 7 Colorful Accent 3" w:uiPriority="52"/>
+    <w:lsdException w:name="Grid Table 1 Light Accent 4" w:uiPriority="46"/>
+    <w:lsdException w:name="Grid Table 2 Accent 4" w:uiPriority="47"/>
+    <w:lsdException w:name="Grid Table 3 Accent 4" w:uiPriority="48"/>
+    <w:lsdException w:name="Grid Table 4 Accent 4" w:uiPriority="49"/>
+    <w:lsdException w:name="Grid Table 5 Dark Accent 4" w:uiPriority="50"/>
+    <w:lsdException w:name="Grid Table 6 Colorful Accent 4" w:uiPriority="51"/>
+    <w:lsdException w:name="Grid Table 7 Colorful Accent 4" w:uiPriority="52"/>
+    <w:lsdException w:name="Grid Table 1 Light Accent 5" w:uiPriority="46"/>
+    <w:lsdException w:name="Grid Table 2 Accent 5" w:uiPriority="47"/>
+    <w:lsdException w:name="Grid Table 3 Accent 5" w:uiPriority="48"/>
+    <w:lsdException w:name="Grid Table 4 Accent 5" w:uiPriority="49"/>
+    <w:lsdException w:name="Grid Table 5 Dark Accent 5" w:uiPriority="50"/>
+    <w:lsdException w:name="Grid Table 6 Colorful Accent 5" w:uiPriority="51"/>
+    <w:lsdException w:name="Grid Table 7 Colorful Accent 5" w:uiPriority="52"/>
+    <w:lsdException w:name="Grid Table 1 Light Accent 6" w:uiPriority="46"/>
+    <w:lsdException w:name="Grid Table 2 Accent 6" w:uiPriority="47"/>
+    <w:lsdException w:name="Grid Table 3 Accent 6" w:uiPriority="48"/>
+    <w:lsdException w:name="Grid Table 4 Accent 6" w:uiPriority="49"/>
+    <w:lsdException w:name="Grid Table 5 Dark Accent 6" w:uiPriority="50"/>
+    <w:lsdException w:name="Grid Table 6 Colorful Accent 6" w:uiPriority="51"/>
+    <w:lsdException w:name="Grid Table 7 Colorful Accent 6" w:uiPriority="52"/>
+    <w:lsdException w:name="List Table 1 Light" w:uiPriority="46"/>
+    <w:lsdException w:name="List Table 2" w:uiPriority="47"/>
+    <w:lsdException w:name="List Table 3" w:uiPriority="48"/>
+    <w:lsdException w:name="List Table 4" w:uiPriority="49"/>
+    <w:lsdException w:name="List Table 5 Dark" w:uiPriority="50"/>
+    <w:lsdException w:name="List Table 6 Colorful" w:uiPriority="51"/>
+    <w:lsdException w:name="List Table 7 Colorful" w:uiPriority="52"/>
+    <w:lsdException w:name="List Table 1 Light Accent 1" w:uiPriority="46"/>
+    <w:lsdException w:name="List Table 2 Accent 1" w:uiPriority="47"/>
+    <w:lsdException w:name="List Table 3 Accent 1" w:uiPriority="48"/>
+    <w:lsdException w:name="List Table 4 Accent 1" w:uiPriority="49"/>
+    <w:lsdException w:name="List Table 5 Dark Accent 1" w:uiPriority="50"/>
+    <w:lsdException w:name="List Table 6 Colorful Accent 1" w:uiPriority="51"/>
+    <w:lsdException w:name="List Table 7 Colorful Accent 1" w:uiPriority="52"/>
+    <w:lsdException w:name="List Table 1 Light Accent 2" w:uiPriority="46"/>
+    <w:lsdException w:name="List Table 2 Accent 2" w:uiPriority="47"/>
+    <w:lsdException w:name="List Table 3 Accent 2" w:uiPriority="48"/>
+    <w:lsdException w:name="List Table 4 Accent 2" w:uiPriority="49"/>
+    <w:lsdException w:name="List Table 5 Dark Accent 2" w:uiPriority="50"/>
+    <w:lsdException w:name="List Table 6 Colorful Accent 2" w:uiPriority="51"/>
+    <w:lsdException w:name="List Table 7 Colorful Accent 2" w:uiPriority="52"/>
+    <w:lsdException w:name="List Table 1 Light Accent 3" w:uiPriority="46"/>
+    <w:lsdException w:name="List Table 2 Accent 3" w:uiPriority="47"/>
+    <w:lsdException w:name="List Table 3 Accent 3" w:uiPriority="48"/>
+    <w:lsdException w:name="List Table 4 Accent 3" w:uiPriority="49"/>
+    <w:lsdException w:name="List Table 5 Dark Accent 3" w:uiPriority="50"/>
+    <w:lsdException w:name="List Table 6 Colorful Accent 3" w:uiPriority="51"/>
+    <w:lsdException w:name="List Table 7 Colorful Accent 3" w:uiPriority="52"/>
+    <w:lsdException w:name="List Table 1 Light Accent 4" w:uiPriority="46"/>
+    <w:lsdException w:name="List Table 2 Accent 4" w:uiPriority="47"/>
+    <w:lsdException w:name="List Table 3 Accent 4" w:uiPriority="48"/>
+    <w:lsdException w:name="List Table 4 Accent 4" w:uiPriority="49"/>
+    <w:lsdException w:name="List Table 5 Dark Accent 4" w:uiPriority="50"/>
+    <w:lsdException w:name="List Table 6 Colorful Accent 4" w:uiPriority="51"/>
+    <w:lsdException w:name="List Table 7 Colorful Accent 4" w:uiPriority="52"/>
+    <w:lsdException w:name="List Table 1 Light Accent 5" w:uiPriority="46"/>
+    <w:lsdException w:name="List Table 2 Accent 5" w:uiPriority="47"/>
+    <w:lsdException w:name="List Table 3 Accent 5" w:uiPriority="48"/>
+    <w:lsdException w:name="List Table 4 Accent 5" w:uiPriority="49"/>
+    <w:lsdException w:name="List Table 5 Dark Accent 5" w:uiPriority="50"/>
+    <w:lsdException w:name="List Table 6 Colorful Accent 5" w:uiPriority="51"/>
+    <w:lsdException w:name="List Table 7 Colorful Accent 5" w:uiPriority="52"/>
+    <w:lsdException w:name="List Table 1 Light Accent 6" w:uiPriority="46"/>
+    <w:lsdException w:name="List Table 2 Accent 6" w:uiPriority="47"/>
+    <w:lsdException w:name="List Table 3 Accent 6" w:uiPriority="48"/>
+    <w:lsdException w:name="List Table 4 Accent 6" w:uiPriority="49"/>
+    <w:lsdException w:name="List Table 5 Dark Accent 6" w:uiPriority="50"/>
+    <w:lsdException w:name="List Table 6 Colorful Accent 6" w:uiPriority="51"/>
+    <w:lsdException w:name="List Table 7 Colorful Accent 6" w:uiPriority="52"/>
+    <w:lsdException w:name="Mention" w:semiHidden="1" w:unhideWhenUsed="1"/>
+    <w:lsdException w:name="Smart Hyperlink" w:semiHidden="1" w:unhideWhenUsed="1"/>
+    <w:lsdException w:name="Hashtag" w:semiHidden="1" w:unhideWhenUsed="1"/>
+    <w:lsdException w:name="Unresolved Mention" w:semiHidden="1" w:unhideWhenUsed="1"/>
+    <w:lsdException w:name="Smart Link" w:semiHidden="1" w:unhideWhenUsed="1"/>
+  </w:latentStyles>
+  <w:style w:type="paragraph" w:default="1" w:styleId="Normal">
+    <w:name w:val="Normal"/>
+    <w:qFormat/>
+    <w:rPr>
+      <w:rFonts w:ascii="Courier New" w:eastAsia="Courier New" w:hAnsi="Courier New" w:cs="Courier New"/>
+    </w:rPr>
+  </w:style>
+  <w:style w:type="paragraph" w:styleId="Heading1">
+    <w:name w:val="heading 1"/>
+    <w:basedOn w:val="Normal"/>
+    <w:link w:val="Heading1Char"/>
+    <w:uiPriority w:val="9"/>
+    <w:qFormat/>
+    <w:pPr>
+      <w:spacing w:line="179" w:lineRule="exact"/>
+      <w:ind w:left="580"/>
+      <w:outlineLvl w:val="0"/>
+    </w:pPr>
+    <w:rPr>
+      <w:sz w:val="16"/>
+      <w:szCs w:val="16"/>
+    </w:rPr>
+  </w:style>
+  <w:style w:type="character" w:default="1" w:styleId="DefaultParagraphFont">
     <w:name w:val="Default Paragraph Font"/>
     <w:uiPriority w:val="1"/>
+    <w:unhideWhenUsed/>
+  </w:style>
+  <w:style w:type="table" w:default="1" w:styleId="TableNormal">
+    <w:name w:val="Normal Table"/>
+    <w:uiPriority w:val="99"/>
     <w:semiHidden/>
     <w:unhideWhenUsed/>
-  </w:style>
-  <w:style w:styleId="TableNormal" w:default="1" w:type="table">
-    <w:name w:val="Table Normal"/>
-    <w:uiPriority w:val="2"/>
-    <w:semiHidden/>
-    <w:unhideWhenUsed/>
-    <w:qFormat/>
     <w:tblPr>
       <w:tblInd w:w="0" w:type="dxa"/>
       <w:tblCellMar>
         <w:top w:w="0" w:type="dxa"/>
-        <w:left w:w="0" w:type="dxa"/>
+        <w:left w:w="108" w:type="dxa"/>
         <w:bottom w:w="0" w:type="dxa"/>
-        <w:right w:w="0" w:type="dxa"/>
+        <w:right w:w="108" w:type="dxa"/>
       </w:tblCellMar>
     </w:tblPr>
   </w:style>
-  <w:style w:styleId="NoList" w:default="1" w:type="numbering">
+  <w:style w:type="numbering" w:default="1" w:styleId="NoList">
     <w:name w:val="No List"/>
     <w:uiPriority w:val="99"/>
     <w:semiHidden/>
     <w:unhideWhenUsed/>
   </w:style>
-  <w:style w:default="1" w:styleId="Normal" w:type="paragraph">
-    <w:name w:val="Normal"/>
-    <w:uiPriority w:val="1"/>
-    <w:qFormat/>
-    <w:pPr/>
-    <w:rPr>
-      <w:rFonts w:ascii="Courier New" w:hAnsi="Courier New" w:eastAsia="Courier New" w:cs="Courier New"/>
-      <w:lang w:val="en-US" w:eastAsia="en-US" w:bidi="ar-SA"/>
-    </w:rPr>
-  </w:style>
-  <w:style w:styleId="BodyText" w:type="paragraph">
+  <w:style w:type="paragraph" w:styleId="BodyText">
     <w:name w:val="Body Text"/>
     <w:basedOn w:val="Normal"/>
     <w:uiPriority w:val="1"/>
@@ -2482,30 +3920,11 @@
       <w:ind w:left="772"/>
     </w:pPr>
     <w:rPr>
-      <w:rFonts w:ascii="Courier New" w:hAnsi="Courier New" w:eastAsia="Courier New" w:cs="Courier New"/>
       <w:sz w:val="16"/>
       <w:szCs w:val="16"/>
-      <w:lang w:val="en-US" w:eastAsia="en-US" w:bidi="ar-SA"/>
     </w:rPr>
   </w:style>
-  <w:style w:styleId="Heading1" w:type="paragraph">
-    <w:name w:val="Heading 1"/>
-    <w:basedOn w:val="Normal"/>
-    <w:uiPriority w:val="1"/>
-    <w:qFormat/>
-    <w:pPr>
-      <w:spacing w:line="179" w:lineRule="exact"/>
-      <w:ind w:left="580"/>
-      <w:outlineLvl w:val="1"/>
-    </w:pPr>
-    <w:rPr>
-      <w:rFonts w:ascii="Courier New" w:hAnsi="Courier New" w:eastAsia="Courier New" w:cs="Courier New"/>
-      <w:sz w:val="16"/>
-      <w:szCs w:val="16"/>
-      <w:lang w:val="en-US" w:eastAsia="en-US" w:bidi="ar-SA"/>
-    </w:rPr>
-  </w:style>
-  <w:style w:styleId="ListParagraph" w:type="paragraph">
+  <w:style w:type="paragraph" w:styleId="ListParagraph">
     <w:name w:val="List Paragraph"/>
     <w:basedOn w:val="Normal"/>
     <w:uiPriority w:val="1"/>
@@ -2514,19 +3933,23 @@
       <w:spacing w:line="176" w:lineRule="exact"/>
       <w:ind w:left="772" w:hanging="192"/>
     </w:pPr>
-    <w:rPr>
-      <w:rFonts w:ascii="Courier New" w:hAnsi="Courier New" w:eastAsia="Courier New" w:cs="Courier New"/>
-      <w:lang w:val="en-US" w:eastAsia="en-US" w:bidi="ar-SA"/>
-    </w:rPr>
   </w:style>
-  <w:style w:styleId="TableParagraph" w:type="paragraph">
+  <w:style w:type="paragraph" w:customStyle="1" w:styleId="TableParagraph">
     <w:name w:val="Table Paragraph"/>
     <w:basedOn w:val="Normal"/>
     <w:uiPriority w:val="1"/>
     <w:qFormat/>
-    <w:pPr/>
+  </w:style>
+  <w:style w:type="character" w:customStyle="1" w:styleId="Heading1Char">
+    <w:name w:val="Heading 1 Char"/>
+    <w:basedOn w:val="DefaultParagraphFont"/>
+    <w:link w:val="Heading1"/>
+    <w:uiPriority w:val="9"/>
+    <w:rsid w:val="00B15B02"/>
     <w:rPr>
-      <w:lang w:val="en-US" w:eastAsia="en-US" w:bidi="ar-SA"/>
+      <w:rFonts w:ascii="Courier New" w:eastAsia="Courier New" w:hAnsi="Courier New" w:cs="Courier New"/>
+      <w:sz w:val="16"/>
+      <w:szCs w:val="16"/>
     </w:rPr>
   </w:style>
 </w:styles>

</xml_diff>